<commit_message>
fix(make): urls en mode standalone (public_ip + infra_domain depuis server_vars) + doc VM VMware
</commit_message>
<xml_diff>
--- a/NOUVEAU-SERVEUR-PROCEDURE.docx
+++ b/NOUVEAU-SERVEUR-PROCEDURE.docx
@@ -36,7 +36,7 @@
           <w:i/>
           <w:sz w:val="24"/>
         </w:rPr>
-        <w:t>Version 1.0 — septembre 2026</w:t>
+        <w:t>Version 1.1 — septembre 2026</w:t>
       </w:r>
     </w:p>
     <w:p>
@@ -510,7 +510,33 @@
         <w:pStyle w:val="ListNumber"/>
       </w:pPr>
       <w:r>
-        <w:t xml:space="preserve">Noter la nouvelle IP publique : sur le serveur, </w:t>
+        <w:t xml:space="preserve">Noter les </w:t>
+      </w:r>
+      <w:r>
+        <w:rPr>
+          <w:b/>
+        </w:rPr>
+        <w:t>deux IP</w:t>
+      </w:r>
+      <w:r>
+        <w:t xml:space="preserve"> du serveur :</w:t>
+      </w:r>
+    </w:p>
+    <w:p>
+      <w:pPr>
+        <w:pStyle w:val="ListBullet2"/>
+      </w:pPr>
+      <w:r>
+        <w:t xml:space="preserve">IP </w:t>
+      </w:r>
+      <w:r>
+        <w:rPr>
+          <w:b/>
+        </w:rPr>
+        <w:t>publique</w:t>
+      </w:r>
+      <w:r>
+        <w:t xml:space="preserve"> : sur le serveur, </w:t>
       </w:r>
       <w:r>
         <w:rPr>
@@ -520,7 +546,72 @@
         <w:t>curl -s https://api.ipify.org</w:t>
       </w:r>
       <w:r>
-        <w:t>.</w:t>
+        <w:t xml:space="preserve"> (c'est elle qui va dans DuckDNS automatiquement, pas besoin de la façonner ici).</w:t>
+      </w:r>
+    </w:p>
+    <w:p>
+      <w:pPr>
+        <w:pStyle w:val="ListBullet2"/>
+      </w:pPr>
+      <w:r>
+        <w:t xml:space="preserve">IP </w:t>
+      </w:r>
+      <w:r>
+        <w:rPr>
+          <w:b/>
+        </w:rPr>
+        <w:t>LAN</w:t>
+      </w:r>
+      <w:r>
+        <w:t xml:space="preserve"> de la VM : </w:t>
+      </w:r>
+      <w:r>
+        <w:rPr>
+          <w:rFonts w:ascii="Consolas" w:hAnsi="Consolas"/>
+          <w:sz w:val="19"/>
+        </w:rPr>
+        <w:t>ip a</w:t>
+      </w:r>
+      <w:r>
+        <w:t xml:space="preserve"> dans la VM (mode VMware </w:t>
+      </w:r>
+      <w:r>
+        <w:rPr>
+          <w:b/>
+        </w:rPr>
+        <w:t>Bridged</w:t>
+      </w:r>
+      <w:r>
+        <w:t xml:space="preserve">, même réseau que ton poste, ex </w:t>
+      </w:r>
+      <w:r>
+        <w:rPr>
+          <w:rFonts w:ascii="Consolas" w:hAnsi="Consolas"/>
+          <w:sz w:val="19"/>
+        </w:rPr>
+        <w:t>192.168.175.x</w:t>
+      </w:r>
+      <w:r>
+        <w:t xml:space="preserve">). C'est </w:t>
+      </w:r>
+      <w:r>
+        <w:rPr>
+          <w:b/>
+        </w:rPr>
+        <w:t>cette IP que tu donneras au prompt `public_ip` de l'étape 5</w:t>
+      </w:r>
+      <w:r>
+        <w:t xml:space="preserve"> et que tu mettras dans le fichier </w:t>
+      </w:r>
+      <w:r>
+        <w:rPr>
+          <w:rFonts w:ascii="Consolas" w:hAnsi="Consolas"/>
+          <w:sz w:val="19"/>
+        </w:rPr>
+        <w:t>hosts</w:t>
+      </w:r>
+      <w:r>
+        <w:t xml:space="preserve"> Windows.</w:t>
       </w:r>
     </w:p>
     <w:p>
@@ -768,7 +859,13 @@
           </w:tcPr>
           <w:p>
             <w:r>
-              <w:t>l'IP publique affichée à l'étape 4</w:t>
+              <w:rPr>
+                <w:b/>
+              </w:rPr>
+              <w:t>l'IP LAN de la VM</w:t>
+            </w:r>
+            <w:r>
+              <w:t xml:space="preserve"> (vue depuis ton poste Windows, mode Bridged) — PAS l'IP publique (le cron DuckDNS s'occupe de l'IP publique tout seul)</w:t>
             </w:r>
           </w:p>
         </w:tc>
@@ -872,6 +969,48 @@
       <w:pPr>
         <w:spacing w:after="80"/>
       </w:pPr>
+    </w:p>
+    <w:p>
+      <w:pPr>
+        <w:ind w:left="360" w:right="144"/>
+      </w:pPr>
+      <w:r>
+        <w:rPr>
+          <w:b/>
+        </w:rPr>
+        <w:t>VM VMware</w:t>
+      </w:r>
+      <w:r>
+        <w:t xml:space="preserve"> : placer la VM sur le réseau </w:t>
+      </w:r>
+      <w:r>
+        <w:rPr>
+          <w:b/>
+        </w:rPr>
+        <w:t>Bridged</w:t>
+      </w:r>
+      <w:r>
+        <w:t xml:space="preserve"> (elle a alors une IP de ton LAN et est joignable par les autres machines). En </w:t>
+      </w:r>
+      <w:r>
+        <w:rPr>
+          <w:b/>
+        </w:rPr>
+        <w:t>NAT</w:t>
+      </w:r>
+      <w:r>
+        <w:t xml:space="preserve">, elle n'est joignable que depuis l'hôte Windows — fonctionnel pour tester depuis ton poste uniquement. IP fixe recommandée (ou réservation DHCP dans VMware), sinon le fichier </w:t>
+      </w:r>
+      <w:r>
+        <w:rPr>
+          <w:rFonts w:ascii="Consolas" w:hAnsi="Consolas"/>
+          <w:sz w:val="19"/>
+        </w:rPr>
+        <w:t>hosts</w:t>
+      </w:r>
+      <w:r>
+        <w:t xml:space="preserve"> casse après un reboot.</w:t>
+      </w:r>
     </w:p>
     <w:p>
       <w:r>
@@ -1449,7 +1588,16 @@
     </w:p>
     <w:p>
       <w:r>
-        <w:t>DuckDNS ne résout le domaine que vers l'IP publique. Depuis le LAN, ajouter</w:t>
+        <w:t xml:space="preserve">DuckDNS pointe le domaine vers l'IP </w:t>
+      </w:r>
+      <w:r>
+        <w:rPr>
+          <w:b/>
+        </w:rPr>
+        <w:t>publique</w:t>
+      </w:r>
+      <w:r>
+        <w:t>. Depuis le LAN, ajouter</w:t>
       </w:r>
     </w:p>
     <w:p>
@@ -1476,7 +1624,16 @@
     </w:p>
     <w:p>
       <w:r>
-        <w:t>en admin sous Windows) :</w:t>
+        <w:t xml:space="preserve">en admin sous Windows) l'IP </w:t>
+      </w:r>
+      <w:r>
+        <w:rPr>
+          <w:b/>
+        </w:rPr>
+        <w:t>LAN</w:t>
+      </w:r>
+      <w:r>
+        <w:t xml:space="preserve"> de la VM (mode Bridged) :</w:t>
       </w:r>
     </w:p>
     <w:p>

</xml_diff>

<commit_message>
docs(deploy): procedure v2 securisee (SSH avant deploy) + fix standalone-prep (PEP668, collections, PATH)
</commit_message>
<xml_diff>
--- a/NOUVEAU-SERVEUR-PROCEDURE.docx
+++ b/NOUVEAU-SERVEUR-PROCEDURE.docx
@@ -12,7 +12,7 @@
           <w:color w:val="1F3B5C"/>
           <w:sz w:val="56"/>
         </w:rPr>
-        <w:t>NOUVEAU SERVEUR</w:t>
+        <w:t>DÉPLOIEMENT D'UN NOUVEAU SERVEUR</w:t>
       </w:r>
     </w:p>
     <w:p>
@@ -24,7 +24,7 @@
           <w:color w:val="444444"/>
           <w:sz w:val="36"/>
         </w:rPr>
-        <w:t>Mise en service pas à pas avec infra-deploie</w:t>
+        <w:t>Procédure complète et sécurisée (v2.0) — infra-deploie</w:t>
       </w:r>
     </w:p>
     <w:p>
@@ -36,7 +36,7 @@
           <w:i/>
           <w:sz w:val="24"/>
         </w:rPr>
-        <w:t>Version 1.1 — septembre 2026</w:t>
+        <w:t>Version 2.0 — septembre 2026</w:t>
       </w:r>
     </w:p>
     <w:p>
@@ -47,7 +47,7 @@
         <w:rPr>
           <w:sz w:val="20"/>
         </w:rPr>
-        <w:t>Commandes et instructions complètes pour deployer l'infrastructure sur un nouveau serveur, sans poste de controle separe.</w:t>
+        <w:t>Sécurisation initiale (SSH) + déploiement de l'infrastructure en mode standalone + retour d'expérience.</w:t>
       </w:r>
     </w:p>
     <w:p>
@@ -69,7 +69,7 @@
         <w:pStyle w:val="Heading1"/>
       </w:pPr>
       <w:r>
-        <w:t>NOUVEAU SERVEUR — Procédure pas à pas</w:t>
+        <w:t>DÉPLOIEMENT D'UN NOUVEAU SERVEUR — Procédure complète (v2.0)</w:t>
       </w:r>
     </w:p>
     <w:p>
@@ -77,12 +77,12 @@
         <w:pStyle w:val="Heading2"/>
       </w:pPr>
       <w:r>
-        <w:t>1. Objectif</w:t>
+        <w:t>Introduction</w:t>
       </w:r>
     </w:p>
     <w:p>
       <w:r>
-        <w:t xml:space="preserve">Ce document décrit la mise en service d'un </w:t>
+        <w:t xml:space="preserve">Ce document décrit, de A à Z, la mise en service d'un </w:t>
       </w:r>
       <w:r>
         <w:rPr>
@@ -91,12 +91,12 @@
         <w:t>nouveau serveur</w:t>
       </w:r>
       <w:r>
-        <w:t xml:space="preserve"> (VPS/VM Ubuntu)</w:t>
+        <w:t xml:space="preserve"> (VPS ou</w:t>
       </w:r>
     </w:p>
     <w:p>
       <w:r>
-        <w:t xml:space="preserve">avec l'infrastructure </w:t>
+        <w:t xml:space="preserve">VM Ubuntu 22.04/24.04) avec l'infrastructure </w:t>
       </w:r>
       <w:r>
         <w:rPr>
@@ -106,65 +106,160 @@
         <w:t>infra-deploie</w:t>
       </w:r>
       <w:r>
-        <w:t xml:space="preserve">, </w:t>
-      </w:r>
+        <w:t xml:space="preserve"> :</w:t>
+      </w:r>
+    </w:p>
+    <w:p>
+      <w:pPr>
+        <w:pStyle w:val="ListBullet"/>
+      </w:pPr>
       <w:r>
         <w:rPr>
           <w:b/>
         </w:rPr>
-        <w:t>sans poste de contrôle séparé</w:t>
-      </w:r>
-    </w:p>
-    <w:p>
-      <w:r>
-        <w:t>(le serveur est à la fois nœud de contrôle Ansible et cible). Aucun WSL ni PC</w:t>
-      </w:r>
-    </w:p>
-    <w:p>
-      <w:r>
-        <w:t xml:space="preserve">Windows n'est requis : on travaille directement </w:t>
+        <w:t>Partie A</w:t>
+      </w:r>
+      <w:r>
+        <w:t xml:space="preserve"> : sécuriser la machine </w:t>
       </w:r>
       <w:r>
         <w:rPr>
           <w:b/>
         </w:rPr>
-        <w:t>en SSH sur le serveur</w:t>
-      </w:r>
-      <w:r>
-        <w:t>.</w:t>
+        <w:t>avant tout</w:t>
+      </w:r>
+      <w:r>
+        <w:t xml:space="preserve"> (connexion SSH, mises à jour,</w:t>
       </w:r>
     </w:p>
     <w:p>
       <w:r>
-        <w:t>Résultat : les outils Grafana, Prometheus, Traefik, Loki/Alloy et Trivy</w:t>
+        <w:t xml:space="preserve">  clé SSH + durcissement).</w:t>
       </w:r>
     </w:p>
     <w:p>
-      <w:r>
-        <w:t xml:space="preserve">tournent derrière un </w:t>
-      </w:r>
+      <w:pPr>
+        <w:pStyle w:val="ListBullet"/>
+      </w:pPr>
       <w:r>
         <w:rPr>
           <w:b/>
         </w:rPr>
-        <w:t>certificat Let's Encrypt réel</w:t>
-      </w:r>
-      <w:r>
-        <w:t xml:space="preserve"> (wildcard via DNS-01</w:t>
+        <w:t>Partie B</w:t>
+      </w:r>
+      <w:r>
+        <w:t xml:space="preserve"> : déployer l'infrastructure de monitoring (Grafana, Prometheus,</w:t>
       </w:r>
     </w:p>
     <w:p>
       <w:r>
-        <w:t xml:space="preserve">DuckDNS) sur </w:t>
+        <w:t xml:space="preserve">  Traefik, Loki/Alloy, Trivy) </w:t>
       </w:r>
       <w:r>
         <w:rPr>
           <w:b/>
         </w:rPr>
-        <w:t>votre propre sous-domaine</w:t>
-      </w:r>
-      <w:r>
-        <w:t xml:space="preserve"> DuckDNS.</w:t>
+        <w:t>en mode standalone</w:t>
+      </w:r>
+      <w:r>
+        <w:t xml:space="preserve"> — le serveur est à la fois</w:t>
+      </w:r>
+    </w:p>
+    <w:p>
+      <w:r>
+        <w:t xml:space="preserve">  nœud de contrôle Ansible et cible, </w:t>
+      </w:r>
+      <w:r>
+        <w:rPr>
+          <w:b/>
+        </w:rPr>
+        <w:t>aucun WSL/PC requis</w:t>
+      </w:r>
+      <w:r>
+        <w:t>.</w:t>
+      </w:r>
+    </w:p>
+    <w:p>
+      <w:pPr>
+        <w:pStyle w:val="ListBullet"/>
+      </w:pPr>
+      <w:r>
+        <w:rPr>
+          <w:b/>
+        </w:rPr>
+        <w:t>Partie C</w:t>
+      </w:r>
+      <w:r>
+        <w:t xml:space="preserve"> : retour d'expérience sur les problèmes rencontrés et leurs</w:t>
+      </w:r>
+    </w:p>
+    <w:p>
+      <w:r>
+        <w:t xml:space="preserve">  correctifs.</w:t>
+      </w:r>
+    </w:p>
+    <w:p>
+      <w:pPr>
+        <w:ind w:left="360" w:right="144"/>
+      </w:pPr>
+      <w:r>
+        <w:rPr>
+          <w:b/>
+        </w:rPr>
+        <w:t>Avant de commencer</w:t>
+      </w:r>
+      <w:r>
+        <w:t xml:space="preserve"> : ce guide est pensé pour une VM </w:t>
+      </w:r>
+      <w:r>
+        <w:rPr>
+          <w:b/>
+        </w:rPr>
+        <w:t>VMware</w:t>
+      </w:r>
+      <w:r>
+        <w:t xml:space="preserve"> (Ubuntu 24.04). En VM, préférer le réseau </w:t>
+      </w:r>
+      <w:r>
+        <w:rPr>
+          <w:b/>
+        </w:rPr>
+        <w:t>Bridged</w:t>
+      </w:r>
+      <w:r>
+        <w:t xml:space="preserve"> (la machine a une IP de votre LAN) et prévoir une </w:t>
+      </w:r>
+      <w:r>
+        <w:rPr>
+          <w:b/>
+        </w:rPr>
+        <w:t>IP statique</w:t>
+      </w:r>
+      <w:r>
+        <w:t xml:space="preserve"> ou une réservation DHCP (sinon le fichier </w:t>
+      </w:r>
+      <w:r>
+        <w:rPr>
+          <w:rFonts w:ascii="Consolas" w:hAnsi="Consolas"/>
+          <w:sz w:val="19"/>
+        </w:rPr>
+        <w:t>hosts</w:t>
+      </w:r>
+      <w:r>
+        <w:t xml:space="preserve"> Windows casse après un reboot).</w:t>
+      </w:r>
+    </w:p>
+    <w:p>
+      <w:r>
+        <w:br w:type="page"/>
+      </w:r>
+    </w:p>
+    <w:p>
+      <w:pPr>
+        <w:pStyle w:val="Heading1"/>
+      </w:pPr>
+      <w:r>
+        <w:t>PARTIE A — Sécuriser la machine (EN PREMIER)</w:t>
       </w:r>
     </w:p>
     <w:p>
@@ -172,7 +267,608 @@
         <w:pStyle w:val="Heading2"/>
       </w:pPr>
       <w:r>
-        <w:t>2. Prérequis</w:t>
+        <w:t>A.1 — Connexion SSH</w:t>
+      </w:r>
+    </w:p>
+    <w:p>
+      <w:r>
+        <w:rPr>
+          <w:b/>
+        </w:rPr>
+        <w:t>PowerShell / cmd (Windows)</w:t>
+      </w:r>
+    </w:p>
+    <w:p>
+      <w:pPr>
+        <w:pStyle w:val="CodeBlock"/>
+      </w:pPr>
+      <w:r>
+        <w:t>ssh &lt;user&gt;@&lt;IP-contact&gt;</w:t>
+      </w:r>
+    </w:p>
+    <w:p>
+      <w:pPr>
+        <w:pStyle w:val="ListBullet"/>
+      </w:pPr>
+      <w:r>
+        <w:rPr>
+          <w:rFonts w:ascii="Consolas" w:hAnsi="Consolas"/>
+          <w:sz w:val="19"/>
+        </w:rPr>
+        <w:t>yes</w:t>
+      </w:r>
+      <w:r>
+        <w:t xml:space="preserve"> à la question sur l'empreinte, puis le mot de passe.</w:t>
+      </w:r>
+    </w:p>
+    <w:p>
+      <w:pPr>
+        <w:pStyle w:val="ListBullet"/>
+      </w:pPr>
+      <w:r>
+        <w:t xml:space="preserve">Coller : clic droit ou </w:t>
+      </w:r>
+      <w:r>
+        <w:rPr>
+          <w:rFonts w:ascii="Consolas" w:hAnsi="Consolas"/>
+          <w:sz w:val="19"/>
+        </w:rPr>
+        <w:t>Ctrl+Shift+V</w:t>
+      </w:r>
+      <w:r>
+        <w:t xml:space="preserve"> ; copier : sélectionner suffit (ou </w:t>
+      </w:r>
+      <w:r>
+        <w:rPr>
+          <w:rFonts w:ascii="Consolas" w:hAnsi="Consolas"/>
+          <w:sz w:val="19"/>
+        </w:rPr>
+        <w:t>Ctrl+Shift+C</w:t>
+      </w:r>
+      <w:r>
+        <w:t>).</w:t>
+      </w:r>
+    </w:p>
+    <w:p>
+      <w:pPr>
+        <w:pStyle w:val="ListBullet"/>
+      </w:pPr>
+      <w:r>
+        <w:t xml:space="preserve">Si </w:t>
+      </w:r>
+      <w:r>
+        <w:rPr>
+          <w:rFonts w:ascii="Consolas" w:hAnsi="Consolas"/>
+          <w:sz w:val="19"/>
+        </w:rPr>
+        <w:t>Connection refused</w:t>
+      </w:r>
+      <w:r>
+        <w:t xml:space="preserve"> : installer le serveur SSH depuis la console VMware :</w:t>
+      </w:r>
+    </w:p>
+    <w:p>
+      <w:pPr>
+        <w:pStyle w:val="CodeBlock"/>
+      </w:pPr>
+      <w:r>
+        <w:t xml:space="preserve">  sudo apt install openssh-server -y</w:t>
+      </w:r>
+    </w:p>
+    <w:p>
+      <w:pPr>
+        <w:pStyle w:val="Heading2"/>
+      </w:pPr>
+      <w:r>
+        <w:t>A.2 — Mises à jour système</w:t>
+      </w:r>
+    </w:p>
+    <w:p>
+      <w:r>
+        <w:rPr>
+          <w:b/>
+        </w:rPr>
+        <w:t>serveur</w:t>
+      </w:r>
+    </w:p>
+    <w:p>
+      <w:pPr>
+        <w:pStyle w:val="CodeBlock"/>
+      </w:pPr>
+      <w:r>
+        <w:t>sudo apt update &amp;&amp; sudo apt upgrade -y</w:t>
+      </w:r>
+    </w:p>
+    <w:p>
+      <w:pPr>
+        <w:pStyle w:val="CodeBlock"/>
+      </w:pPr>
+      <w:r>
+        <w:t>sudo apt autoremove -y</w:t>
+      </w:r>
+    </w:p>
+    <w:p>
+      <w:pPr>
+        <w:pStyle w:val="CodeBlock"/>
+      </w:pPr>
+      <w:r>
+        <w:t>sudo reboot &amp;&amp; sleep 30 &amp;&amp; exit   # se reconnecter après ~30 s</w:t>
+      </w:r>
+    </w:p>
+    <w:p>
+      <w:pPr>
+        <w:ind w:left="360" w:right="144"/>
+      </w:pPr>
+      <w:r>
+        <w:t>UFW, fail2ban et les mises à jour automatiques (</w:t>
+      </w:r>
+      <w:r>
+        <w:rPr>
+          <w:rFonts w:ascii="Consolas" w:hAnsi="Consolas"/>
+          <w:sz w:val="19"/>
+        </w:rPr>
+        <w:t>unattended-upgrades</w:t>
+      </w:r>
+      <w:r>
+        <w:t xml:space="preserve">) sont </w:t>
+      </w:r>
+      <w:r>
+        <w:rPr>
+          <w:b/>
+        </w:rPr>
+        <w:t>déjà gérés par Ansible</w:t>
+      </w:r>
+      <w:r>
+        <w:t xml:space="preserve"> en Partie B (rôle </w:t>
+      </w:r>
+      <w:r>
+        <w:rPr>
+          <w:rFonts w:ascii="Consolas" w:hAnsi="Consolas"/>
+          <w:sz w:val="19"/>
+        </w:rPr>
+        <w:t>common</w:t>
+      </w:r>
+      <w:r>
+        <w:t>). Pas de redondance ici : on ne refait pas ces étapes à la main.</w:t>
+      </w:r>
+    </w:p>
+    <w:p>
+      <w:pPr>
+        <w:pStyle w:val="Heading2"/>
+      </w:pPr>
+      <w:r>
+        <w:t>A.3 — Authentification SSH par clé</w:t>
+      </w:r>
+    </w:p>
+    <w:p>
+      <w:r>
+        <w:t>Principe : une paire de clés est générée sur le poste Windows. La clé privée</w:t>
+      </w:r>
+    </w:p>
+    <w:p>
+      <w:r>
+        <w:t>n'en sort jamais ; seule la clé publique est copiée dans</w:t>
+      </w:r>
+    </w:p>
+    <w:p>
+      <w:r>
+        <w:rPr>
+          <w:rFonts w:ascii="Consolas" w:hAnsi="Consolas"/>
+          <w:sz w:val="19"/>
+        </w:rPr>
+        <w:t>~/.ssh/authorized_keys</w:t>
+      </w:r>
+      <w:r>
+        <w:t xml:space="preserve"> du serveur.</w:t>
+      </w:r>
+    </w:p>
+    <w:p>
+      <w:pPr>
+        <w:pStyle w:val="Heading3"/>
+      </w:pPr>
+      <w:r>
+        <w:t>A.3.1 Générer la paire de clés (Windows)</w:t>
+      </w:r>
+    </w:p>
+    <w:p>
+      <w:r>
+        <w:rPr>
+          <w:b/>
+        </w:rPr>
+        <w:t>PowerShell / cmd (Windows)</w:t>
+      </w:r>
+    </w:p>
+    <w:p>
+      <w:pPr>
+        <w:pStyle w:val="CodeBlock"/>
+      </w:pPr>
+      <w:r>
+        <w:t>ssh-keygen -t ed25519</w:t>
+      </w:r>
+    </w:p>
+    <w:p>
+      <w:pPr>
+        <w:pStyle w:val="CodeBlock"/>
+      </w:pPr>
+      <w:r>
+        <w:t># Entrée pour l'emplacement par défaut ; passphrase facultative</w:t>
+      </w:r>
+    </w:p>
+    <w:p>
+      <w:r>
+        <w:t>Ed25519 est préféré à RSA (clés courtes, rapides, robustes).</w:t>
+      </w:r>
+    </w:p>
+    <w:p>
+      <w:pPr>
+        <w:pStyle w:val="Heading3"/>
+      </w:pPr>
+      <w:r>
+        <w:t>A.3.2 Copier la clé publique sur le serveur (Windows)</w:t>
+      </w:r>
+    </w:p>
+    <w:p>
+      <w:r>
+        <w:t xml:space="preserve">Windows n'a pas </w:t>
+      </w:r>
+      <w:r>
+        <w:rPr>
+          <w:rFonts w:ascii="Consolas" w:hAnsi="Consolas"/>
+          <w:sz w:val="19"/>
+        </w:rPr>
+        <w:t>ssh-copy-id</w:t>
+      </w:r>
+      <w:r>
+        <w:t xml:space="preserve"> ; on l'émule avec un pipe :</w:t>
+      </w:r>
+    </w:p>
+    <w:p>
+      <w:r>
+        <w:rPr>
+          <w:b/>
+        </w:rPr>
+        <w:t>PowerShell</w:t>
+      </w:r>
+    </w:p>
+    <w:p>
+      <w:pPr>
+        <w:pStyle w:val="CodeBlock"/>
+      </w:pPr>
+      <w:r>
+        <w:t>type $env:USERPROFILE\.ssh\id_ed25519.pub | ssh &lt;user&gt;@&lt;IP-contact&gt; "mkdir -p ~/.ssh &amp;&amp; cat &gt;&gt; ~/.ssh/authorized_keys &amp;&amp; chmod 700 ~/.ssh &amp;&amp; chmod 600 ~/.ssh/authorized_keys"</w:t>
+      </w:r>
+    </w:p>
+    <w:p>
+      <w:r>
+        <w:rPr>
+          <w:b/>
+        </w:rPr>
+        <w:t>cmd</w:t>
+      </w:r>
+    </w:p>
+    <w:p>
+      <w:pPr>
+        <w:pStyle w:val="CodeBlock"/>
+      </w:pPr>
+      <w:r>
+        <w:t>type "%USERPROFILE%\.ssh\id_ed25519.pub" | ssh &lt;user&gt;@&lt;IP-contact&gt; "mkdir -p ~/.ssh &amp;&amp; cat &gt;&gt; ~/.ssh/authorized_keys &amp;&amp; chmod 700 ~/.ssh &amp;&amp; chmod 600 ~/.ssh/authorized_keys"</w:t>
+      </w:r>
+    </w:p>
+    <w:p>
+      <w:r>
+        <w:t xml:space="preserve">Le mot de passe est demandé une dernière fois. </w:t>
+      </w:r>
+      <w:r>
+        <w:rPr>
+          <w:b/>
+        </w:rPr>
+        <w:t>Test</w:t>
+      </w:r>
+      <w:r>
+        <w:t xml:space="preserve"> :</w:t>
+      </w:r>
+    </w:p>
+    <w:p>
+      <w:r>
+        <w:rPr>
+          <w:rFonts w:ascii="Consolas" w:hAnsi="Consolas"/>
+          <w:sz w:val="19"/>
+        </w:rPr>
+        <w:t>ssh &lt;user&gt;@&lt;IP-contact&gt;</w:t>
+      </w:r>
+      <w:r>
+        <w:t xml:space="preserve"> doit ouvrir la session sans mot de passe.</w:t>
+      </w:r>
+    </w:p>
+    <w:p>
+      <w:pPr>
+        <w:pStyle w:val="Heading3"/>
+      </w:pPr>
+      <w:r>
+        <w:t>A.3.3 Durcir le serveur SSH</w:t>
+      </w:r>
+    </w:p>
+    <w:p>
+      <w:r>
+        <w:t xml:space="preserve">Fichier dédié dans </w:t>
+      </w:r>
+      <w:r>
+        <w:rPr>
+          <w:rFonts w:ascii="Consolas" w:hAnsi="Consolas"/>
+          <w:sz w:val="19"/>
+        </w:rPr>
+        <w:t>/etc/ssh/sshd_config.d/</w:t>
+      </w:r>
+      <w:r>
+        <w:t xml:space="preserve">, jamais dans </w:t>
+      </w:r>
+      <w:r>
+        <w:rPr>
+          <w:rFonts w:ascii="Consolas" w:hAnsi="Consolas"/>
+          <w:sz w:val="19"/>
+        </w:rPr>
+        <w:t>sshd_config</w:t>
+      </w:r>
+      <w:r>
+        <w:t xml:space="preserve"> :</w:t>
+      </w:r>
+    </w:p>
+    <w:p>
+      <w:r>
+        <w:rPr>
+          <w:b/>
+        </w:rPr>
+        <w:t>serveur (session SSH)</w:t>
+      </w:r>
+    </w:p>
+    <w:p>
+      <w:pPr>
+        <w:pStyle w:val="CodeBlock"/>
+      </w:pPr>
+      <w:r>
+        <w:t>sudo tee /etc/ssh/sshd_config.d/00-hardening.conf &lt;&lt;'EOF'</w:t>
+      </w:r>
+    </w:p>
+    <w:p>
+      <w:pPr>
+        <w:pStyle w:val="CodeBlock"/>
+      </w:pPr>
+      <w:r>
+        <w:t>PasswordAuthentication no</w:t>
+      </w:r>
+    </w:p>
+    <w:p>
+      <w:pPr>
+        <w:pStyle w:val="CodeBlock"/>
+      </w:pPr>
+      <w:r>
+        <w:t>PermitRootLogin no</w:t>
+      </w:r>
+    </w:p>
+    <w:p>
+      <w:pPr>
+        <w:pStyle w:val="CodeBlock"/>
+      </w:pPr>
+      <w:r>
+        <w:t>PubkeyAuthentication yes</w:t>
+      </w:r>
+    </w:p>
+    <w:p>
+      <w:pPr>
+        <w:pStyle w:val="CodeBlock"/>
+      </w:pPr>
+      <w:r>
+        <w:t>MaxAuthTries 3</w:t>
+      </w:r>
+    </w:p>
+    <w:p>
+      <w:pPr>
+        <w:pStyle w:val="CodeBlock"/>
+      </w:pPr>
+      <w:r>
+        <w:t>X11Forwarding no</w:t>
+      </w:r>
+    </w:p>
+    <w:p>
+      <w:pPr>
+        <w:pStyle w:val="CodeBlock"/>
+      </w:pPr>
+      <w:r>
+        <w:t>EOF</w:t>
+      </w:r>
+    </w:p>
+    <w:p>
+      <w:pPr>
+        <w:pStyle w:val="CodeBlock"/>
+      </w:pPr>
+      <w:r>
+        <w:t>sudo sshd -t                          # valide la syntaxe (silence = OK)</w:t>
+      </w:r>
+    </w:p>
+    <w:p>
+      <w:pPr>
+        <w:pStyle w:val="CodeBlock"/>
+      </w:pPr>
+      <w:r>
+        <w:t>sudo sshd -T | grep -i passwordauth   # doit afficher : passwordauthentication no</w:t>
+      </w:r>
+    </w:p>
+    <w:p>
+      <w:pPr>
+        <w:pStyle w:val="CodeBlock"/>
+      </w:pPr>
+      <w:r>
+        <w:t>sudo systemctl restart ssh</w:t>
+      </w:r>
+    </w:p>
+    <w:p>
+      <w:pPr>
+        <w:ind w:left="360" w:right="144"/>
+      </w:pPr>
+      <w:r>
+        <w:rPr>
+          <w:b/>
+        </w:rPr>
+        <w:t>Piège Ubuntu 24.04</w:t>
+      </w:r>
+      <w:r>
+        <w:t xml:space="preserve"> : le préfixe </w:t>
+      </w:r>
+      <w:r>
+        <w:rPr>
+          <w:rFonts w:ascii="Consolas" w:hAnsi="Consolas"/>
+          <w:sz w:val="19"/>
+        </w:rPr>
+        <w:t>00-</w:t>
+      </w:r>
+      <w:r>
+        <w:t xml:space="preserve"> est </w:t>
+      </w:r>
+      <w:r>
+        <w:rPr>
+          <w:b/>
+        </w:rPr>
+        <w:t>obligatoire</w:t>
+      </w:r>
+      <w:r>
+        <w:t xml:space="preserve">. L'installeur crée </w:t>
+      </w:r>
+      <w:r>
+        <w:rPr>
+          <w:rFonts w:ascii="Consolas" w:hAnsi="Consolas"/>
+          <w:sz w:val="19"/>
+        </w:rPr>
+        <w:t>/etc/ssh/sshd_config.d/50-cloud-init.conf</w:t>
+      </w:r>
+      <w:r>
+        <w:t xml:space="preserve"> contenant </w:t>
+      </w:r>
+      <w:r>
+        <w:rPr>
+          <w:rFonts w:ascii="Consolas" w:hAnsi="Consolas"/>
+          <w:sz w:val="19"/>
+        </w:rPr>
+        <w:t>PasswordAuthentication yes</w:t>
+      </w:r>
+      <w:r>
+        <w:t xml:space="preserve"> ; OpenSSH lit les fichiers par ordre alphabétique et garde la </w:t>
+      </w:r>
+      <w:r>
+        <w:rPr>
+          <w:b/>
+        </w:rPr>
+        <w:t>première</w:t>
+      </w:r>
+      <w:r>
+        <w:t xml:space="preserve"> valeur. Un fichier nommé </w:t>
+      </w:r>
+      <w:r>
+        <w:rPr>
+          <w:rFonts w:ascii="Consolas" w:hAnsi="Consolas"/>
+          <w:sz w:val="19"/>
+        </w:rPr>
+        <w:t>hardening.conf</w:t>
+      </w:r>
+      <w:r>
+        <w:t xml:space="preserve"> serait lu après et </w:t>
+      </w:r>
+      <w:r>
+        <w:rPr>
+          <w:b/>
+        </w:rPr>
+        <w:t>ignoré</w:t>
+      </w:r>
+      <w:r>
+        <w:t xml:space="preserve"> → le mot de passe resterait accepté.</w:t>
+      </w:r>
+    </w:p>
+    <w:p>
+      <w:pPr>
+        <w:pStyle w:val="Heading3"/>
+      </w:pPr>
+      <w:r>
+        <w:t>A.3.4 Vérifier</w:t>
+      </w:r>
+    </w:p>
+    <w:p>
+      <w:r>
+        <w:t xml:space="preserve">Garder la session SSH ouverte, puis dans un </w:t>
+      </w:r>
+      <w:r>
+        <w:rPr>
+          <w:b/>
+        </w:rPr>
+        <w:t>second terminal</w:t>
+      </w:r>
+      <w:r>
+        <w:t xml:space="preserve"> (Windows) :</w:t>
+      </w:r>
+    </w:p>
+    <w:p>
+      <w:pPr>
+        <w:pStyle w:val="CodeBlock"/>
+      </w:pPr>
+      <w:r>
+        <w:t>ssh &lt;user&gt;@&lt;IP-contact&gt;                              # doit passer sans mot de passe</w:t>
+      </w:r>
+    </w:p>
+    <w:p>
+      <w:pPr>
+        <w:pStyle w:val="CodeBlock"/>
+      </w:pPr>
+      <w:r>
+        <w:t>ssh -o PubkeyAuthentication=no &lt;user&gt;@&lt;IP-contact&gt;   # doit échouer : Permission denied (publickey).</w:t>
+      </w:r>
+    </w:p>
+    <w:p>
+      <w:r>
+        <w:t>En cas de blocage : la console VMware reste accessible avec le mot de passe</w:t>
+      </w:r>
+    </w:p>
+    <w:p>
+      <w:r>
+        <w:t xml:space="preserve">(supprimer </w:t>
+      </w:r>
+      <w:r>
+        <w:rPr>
+          <w:rFonts w:ascii="Consolas" w:hAnsi="Consolas"/>
+          <w:sz w:val="19"/>
+        </w:rPr>
+        <w:t>00-hardening.conf</w:t>
+      </w:r>
+      <w:r>
+        <w:t xml:space="preserve"> et redémarrer </w:t>
+      </w:r>
+      <w:r>
+        <w:rPr>
+          <w:rFonts w:ascii="Consolas" w:hAnsi="Consolas"/>
+          <w:sz w:val="19"/>
+        </w:rPr>
+        <w:t>ssh</w:t>
+      </w:r>
+      <w:r>
+        <w:t>).</w:t>
+      </w:r>
+    </w:p>
+    <w:p>
+      <w:r>
+        <w:br w:type="page"/>
+      </w:r>
+    </w:p>
+    <w:p>
+      <w:pPr>
+        <w:pStyle w:val="Heading1"/>
+      </w:pPr>
+      <w:r>
+        <w:t>PARTIE B — Déployer l'infrastructure (infra-deploie)</w:t>
+      </w:r>
+    </w:p>
+    <w:p>
+      <w:pPr>
+        <w:pStyle w:val="Heading2"/>
+      </w:pPr>
+      <w:r>
+        <w:t>B.1 — Prérequis</w:t>
       </w:r>
     </w:p>
     <w:tbl>
@@ -253,7 +949,7 @@
           </w:tcPr>
           <w:p>
             <w:r>
-              <w:t xml:space="preserve">Ubuntu 22.04 / 24.04, accès SSH, compte avec </w:t>
+              <w:t xml:space="preserve">Ubuntu 22.04 / 24.04, accès SSH + compte </w:t>
             </w:r>
             <w:r>
               <w:rPr>
@@ -282,29 +978,7 @@
           </w:tcPr>
           <w:p>
             <w:r>
-              <w:t>2 vCPU / 4 Go RAM minimum (8 Go si SonarQube) / 40 Go SSD</w:t>
-            </w:r>
-          </w:p>
-        </w:tc>
-      </w:tr>
-      <w:tr>
-        <w:tc>
-          <w:tcPr>
-            <w:tcW w:type="dxa" w:w="4320"/>
-          </w:tcPr>
-          <w:p>
-            <w:r>
-              <w:t>Internet</w:t>
-            </w:r>
-          </w:p>
-        </w:tc>
-        <w:tc>
-          <w:tcPr>
-            <w:tcW w:type="dxa" w:w="4320"/>
-          </w:tcPr>
-          <w:p>
-            <w:r>
-              <w:t>Ports 80 et 443 ouverts en sortie (DuckDNS = DNS-01, IP privée OK)</w:t>
+              <w:t>2 vCPU / 4 Go RAM min (8 Go si SonarQube) / 40 Go disque</w:t>
             </w:r>
           </w:p>
         </w:tc>
@@ -326,7 +1000,7 @@
           </w:tcPr>
           <w:p>
             <w:r>
-              <w:t xml:space="preserve">un compte GitHub (clone) et un compte </w:t>
+              <w:t xml:space="preserve">1 compte GitHub (clone) + 1 compte </w:t>
             </w:r>
             <w:r>
               <w:rPr>
@@ -334,8 +1008,27 @@
               </w:rPr>
               <w:t>DuckDNS</w:t>
             </w:r>
+          </w:p>
+        </w:tc>
+      </w:tr>
+      <w:tr>
+        <w:tc>
+          <w:tcPr>
+            <w:tcW w:type="dxa" w:w="4320"/>
+          </w:tcPr>
+          <w:p>
             <w:r>
-              <w:t xml:space="preserve"> (gratuit)</w:t>
+              <w:t>Réseau</w:t>
+            </w:r>
+          </w:p>
+        </w:tc>
+        <w:tc>
+          <w:tcPr>
+            <w:tcW w:type="dxa" w:w="4320"/>
+          </w:tcPr>
+          <w:p>
+            <w:r>
+              <w:t>Ports 80/443 HTTPS en sortie (validation DNS-01 = IP privée OK)</w:t>
             </w:r>
           </w:p>
         </w:tc>
@@ -351,12 +1044,15 @@
         <w:pStyle w:val="Heading2"/>
       </w:pPr>
       <w:r>
-        <w:t>3. Sur le serveur : récupérer le projet</w:t>
+        <w:t>B.2 — Récupérer le projet</w:t>
       </w:r>
     </w:p>
     <w:p>
       <w:r>
-        <w:t>Se connecter, puis installer les outils de base et cloner le dépôt.</w:t>
+        <w:rPr>
+          <w:b/>
+        </w:rPr>
+        <w:t>serveur</w:t>
       </w:r>
     </w:p>
     <w:p>
@@ -364,7 +1060,7 @@
         <w:pStyle w:val="CodeBlock"/>
       </w:pPr>
       <w:r>
-        <w:t>ssh &lt;utilisateur&gt;@&lt;ip-du-serveur&gt;</w:t>
+        <w:t>ssh &lt;user&gt;@&lt;IP-contact&gt;</w:t>
       </w:r>
     </w:p>
     <w:p>
@@ -388,7 +1084,7 @@
         <w:pStyle w:val="CodeBlock"/>
       </w:pPr>
       <w:r>
-        <w:t>sudo apt update</w:t>
+        <w:t>sudo apt install -y git make curl nano</w:t>
       </w:r>
     </w:p>
     <w:p>
@@ -396,7 +1092,7 @@
         <w:pStyle w:val="CodeBlock"/>
       </w:pPr>
       <w:r>
-        <w:t>sudo apt install -y git make curl nano</w:t>
+        <w:t xml:space="preserve"> </w:t>
       </w:r>
     </w:p>
     <w:p>
@@ -404,7 +1100,7 @@
         <w:pStyle w:val="CodeBlock"/>
       </w:pPr>
       <w:r>
-        <w:t xml:space="preserve"> </w:t>
+        <w:t># cloner le dépôt</w:t>
       </w:r>
     </w:p>
     <w:p>
@@ -412,7 +1108,7 @@
         <w:pStyle w:val="CodeBlock"/>
       </w:pPr>
       <w:r>
-        <w:t># cloner le dépôt (remplacer l'URL si le dépôt est privé / autre propriétaire)</w:t>
+        <w:t>git clone https://github.com/papadiouf13/infra-deploie.git</w:t>
       </w:r>
     </w:p>
     <w:p>
@@ -420,7 +1116,224 @@
         <w:pStyle w:val="CodeBlock"/>
       </w:pPr>
       <w:r>
-        <w:t>git clone https://github.com/papadiouf13/infra-deploie.git</w:t>
+        <w:t>cd infra-deploie</w:t>
+      </w:r>
+    </w:p>
+    <w:p>
+      <w:pPr>
+        <w:pStyle w:val="Heading2"/>
+      </w:pPr>
+      <w:r>
+        <w:t>B.3 — Créer son sous-domaine DuckDNS</w:t>
+      </w:r>
+    </w:p>
+    <w:p>
+      <w:r>
+        <w:t xml:space="preserve">Chaque serveur a </w:t>
+      </w:r>
+      <w:r>
+        <w:rPr>
+          <w:b/>
+        </w:rPr>
+        <w:t>son propre sous-domaine</w:t>
+      </w:r>
+      <w:r>
+        <w:t xml:space="preserve"> DuckDNS.</w:t>
+      </w:r>
+    </w:p>
+    <w:p>
+      <w:pPr>
+        <w:pStyle w:val="ListNumber"/>
+      </w:pPr>
+      <w:r>
+        <w:t>https://www.duckdns.org → se connecter.</w:t>
+      </w:r>
+    </w:p>
+    <w:p>
+      <w:pPr>
+        <w:pStyle w:val="ListNumber"/>
+      </w:pPr>
+      <w:r>
+        <w:rPr>
+          <w:b/>
+        </w:rPr>
+        <w:t>add domain</w:t>
+      </w:r>
+      <w:r>
+        <w:t xml:space="preserve"> → noter le nom choisi (ex : </w:t>
+      </w:r>
+      <w:r>
+        <w:rPr>
+          <w:rFonts w:ascii="Consolas" w:hAnsi="Consolas"/>
+          <w:sz w:val="19"/>
+        </w:rPr>
+        <w:t>inframonitoring</w:t>
+      </w:r>
+      <w:r>
+        <w:t>).</w:t>
+      </w:r>
+    </w:p>
+    <w:p>
+      <w:pPr>
+        <w:pStyle w:val="ListNumber"/>
+      </w:pPr>
+      <w:r>
+        <w:t xml:space="preserve">Copier le </w:t>
+      </w:r>
+      <w:r>
+        <w:rPr>
+          <w:b/>
+        </w:rPr>
+        <w:t>token</w:t>
+      </w:r>
+      <w:r>
+        <w:t xml:space="preserve"> du domaine (il ira dans le vault, partie B.6).</w:t>
+      </w:r>
+    </w:p>
+    <w:p>
+      <w:pPr>
+        <w:pStyle w:val="ListNumber"/>
+      </w:pPr>
+      <w:r>
+        <w:t xml:space="preserve">Noter les </w:t>
+      </w:r>
+      <w:r>
+        <w:rPr>
+          <w:b/>
+        </w:rPr>
+        <w:t>deux IP</w:t>
+      </w:r>
+      <w:r>
+        <w:t xml:space="preserve"> :</w:t>
+      </w:r>
+    </w:p>
+    <w:p>
+      <w:pPr>
+        <w:pStyle w:val="ListBullet2"/>
+      </w:pPr>
+      <w:r>
+        <w:t xml:space="preserve">IP </w:t>
+      </w:r>
+      <w:r>
+        <w:rPr>
+          <w:b/>
+        </w:rPr>
+        <w:t>publique</w:t>
+      </w:r>
+      <w:r>
+        <w:t xml:space="preserve"> : </w:t>
+      </w:r>
+      <w:r>
+        <w:rPr>
+          <w:rFonts w:ascii="Consolas" w:hAnsi="Consolas"/>
+          <w:sz w:val="19"/>
+        </w:rPr>
+        <w:t>curl -s https://api.ipify.org</w:t>
+      </w:r>
+      <w:r>
+        <w:t xml:space="preserve"> (c'est celle que DuckDNS</w:t>
+      </w:r>
+    </w:p>
+    <w:p>
+      <w:r>
+        <w:t xml:space="preserve">     affiche automatiquement via le cron du serveur — rien à forcer ici) ;</w:t>
+      </w:r>
+    </w:p>
+    <w:p>
+      <w:pPr>
+        <w:pStyle w:val="ListBullet2"/>
+      </w:pPr>
+      <w:r>
+        <w:t xml:space="preserve">IP </w:t>
+      </w:r>
+      <w:r>
+        <w:rPr>
+          <w:b/>
+        </w:rPr>
+        <w:t>LAN</w:t>
+      </w:r>
+      <w:r>
+        <w:t xml:space="preserve"> : </w:t>
+      </w:r>
+      <w:r>
+        <w:rPr>
+          <w:rFonts w:ascii="Consolas" w:hAnsi="Consolas"/>
+          <w:sz w:val="19"/>
+        </w:rPr>
+        <w:t>ip a</w:t>
+      </w:r>
+      <w:r>
+        <w:t xml:space="preserve"> sur le serveur (en VM Bridged, ex </w:t>
+      </w:r>
+      <w:r>
+        <w:rPr>
+          <w:rFonts w:ascii="Consolas" w:hAnsi="Consolas"/>
+          <w:sz w:val="19"/>
+        </w:rPr>
+        <w:t>192.168.175.x</w:t>
+      </w:r>
+      <w:r>
+        <w:t>) —</w:t>
+      </w:r>
+    </w:p>
+    <w:p>
+      <w:r>
+        <w:t xml:space="preserve">     </w:t>
+      </w:r>
+      <w:r>
+        <w:rPr>
+          <w:b/>
+        </w:rPr>
+        <w:t>c'est celle qu'on donnera au prompt `public_ip` du script (B.4)</w:t>
+      </w:r>
+      <w:r>
+        <w:t>.</w:t>
+      </w:r>
+    </w:p>
+    <w:p>
+      <w:pPr>
+        <w:ind w:left="360" w:right="144"/>
+      </w:pPr>
+      <w:r>
+        <w:t>⚠️ Ne jamais réutiliser un sous-domaine déjà rattaché à un autre serveur.</w:t>
+      </w:r>
+    </w:p>
+    <w:p>
+      <w:pPr>
+        <w:pStyle w:val="Heading2"/>
+      </w:pPr>
+      <w:r>
+        <w:t>B.4 — Préparation automatique du serveur</w:t>
+      </w:r>
+    </w:p>
+    <w:p>
+      <w:r>
+        <w:rPr>
+          <w:rFonts w:ascii="Consolas" w:hAnsi="Consolas"/>
+          <w:sz w:val="19"/>
+        </w:rPr>
+        <w:t>standalone-prep.sh</w:t>
+      </w:r>
+      <w:r>
+        <w:t xml:space="preserve"> installe Ansible + les collections Docker, crée</w:t>
+      </w:r>
+    </w:p>
+    <w:p>
+      <w:r>
+        <w:t>l'inventaire local, copie les fichiers de variables depuis les exemples et</w:t>
+      </w:r>
+    </w:p>
+    <w:p>
+      <w:r>
+        <w:t>génère le mot de passe vault.</w:t>
+      </w:r>
+    </w:p>
+    <w:p>
+      <w:r>
+        <w:rPr>
+          <w:b/>
+        </w:rPr>
+        <w:t>serveur</w:t>
       </w:r>
     </w:p>
     <w:p>
@@ -433,185 +1346,10 @@
     </w:p>
     <w:p>
       <w:pPr>
-        <w:pStyle w:val="Heading2"/>
+        <w:pStyle w:val="CodeBlock"/>
       </w:pPr>
       <w:r>
-        <w:t>4. Créer son domaine DuckDNS</w:t>
-      </w:r>
-    </w:p>
-    <w:p>
-      <w:r>
-        <w:t xml:space="preserve">Chaque serveur possède </w:t>
-      </w:r>
-      <w:r>
-        <w:rPr>
-          <w:b/>
-        </w:rPr>
-        <w:t>son propre sous-domaine DuckDNS</w:t>
-      </w:r>
-      <w:r>
-        <w:t>.</w:t>
-      </w:r>
-    </w:p>
-    <w:p>
-      <w:pPr>
-        <w:pStyle w:val="ListNumber"/>
-      </w:pPr>
-      <w:r>
-        <w:t>Aller sur https://www.duckdns.org et se connecter.</w:t>
-      </w:r>
-    </w:p>
-    <w:p>
-      <w:pPr>
-        <w:pStyle w:val="ListNumber"/>
-      </w:pPr>
-      <w:r>
-        <w:t xml:space="preserve">Cliquer </w:t>
-      </w:r>
-      <w:r>
-        <w:rPr>
-          <w:b/>
-        </w:rPr>
-        <w:t>add domain</w:t>
-      </w:r>
-      <w:r>
-        <w:t xml:space="preserve"> et noter le nom choisi (ex : </w:t>
-      </w:r>
-      <w:r>
-        <w:rPr>
-          <w:rFonts w:ascii="Consolas" w:hAnsi="Consolas"/>
-          <w:sz w:val="19"/>
-        </w:rPr>
-        <w:t>moninfra</w:t>
-      </w:r>
-      <w:r>
-        <w:t>).</w:t>
-      </w:r>
-    </w:p>
-    <w:p>
-      <w:pPr>
-        <w:pStyle w:val="ListNumber"/>
-      </w:pPr>
-      <w:r>
-        <w:t xml:space="preserve">Copier le </w:t>
-      </w:r>
-      <w:r>
-        <w:rPr>
-          <w:b/>
-        </w:rPr>
-        <w:t>token</w:t>
-      </w:r>
-      <w:r>
-        <w:t xml:space="preserve"> de ce domaine (il servira à l'étape 5).</w:t>
-      </w:r>
-    </w:p>
-    <w:p>
-      <w:pPr>
-        <w:pStyle w:val="ListNumber"/>
-      </w:pPr>
-      <w:r>
-        <w:t xml:space="preserve">Noter les </w:t>
-      </w:r>
-      <w:r>
-        <w:rPr>
-          <w:b/>
-        </w:rPr>
-        <w:t>deux IP</w:t>
-      </w:r>
-      <w:r>
-        <w:t xml:space="preserve"> du serveur :</w:t>
-      </w:r>
-    </w:p>
-    <w:p>
-      <w:pPr>
-        <w:pStyle w:val="ListBullet2"/>
-      </w:pPr>
-      <w:r>
-        <w:t xml:space="preserve">IP </w:t>
-      </w:r>
-      <w:r>
-        <w:rPr>
-          <w:b/>
-        </w:rPr>
-        <w:t>publique</w:t>
-      </w:r>
-      <w:r>
-        <w:t xml:space="preserve"> : sur le serveur, </w:t>
-      </w:r>
-      <w:r>
-        <w:rPr>
-          <w:rFonts w:ascii="Consolas" w:hAnsi="Consolas"/>
-          <w:sz w:val="19"/>
-        </w:rPr>
-        <w:t>curl -s https://api.ipify.org</w:t>
-      </w:r>
-      <w:r>
-        <w:t xml:space="preserve"> (c'est elle qui va dans DuckDNS automatiquement, pas besoin de la façonner ici).</w:t>
-      </w:r>
-    </w:p>
-    <w:p>
-      <w:pPr>
-        <w:pStyle w:val="ListBullet2"/>
-      </w:pPr>
-      <w:r>
-        <w:t xml:space="preserve">IP </w:t>
-      </w:r>
-      <w:r>
-        <w:rPr>
-          <w:b/>
-        </w:rPr>
-        <w:t>LAN</w:t>
-      </w:r>
-      <w:r>
-        <w:t xml:space="preserve"> de la VM : </w:t>
-      </w:r>
-      <w:r>
-        <w:rPr>
-          <w:rFonts w:ascii="Consolas" w:hAnsi="Consolas"/>
-          <w:sz w:val="19"/>
-        </w:rPr>
-        <w:t>ip a</w:t>
-      </w:r>
-      <w:r>
-        <w:t xml:space="preserve"> dans la VM (mode VMware </w:t>
-      </w:r>
-      <w:r>
-        <w:rPr>
-          <w:b/>
-        </w:rPr>
-        <w:t>Bridged</w:t>
-      </w:r>
-      <w:r>
-        <w:t xml:space="preserve">, même réseau que ton poste, ex </w:t>
-      </w:r>
-      <w:r>
-        <w:rPr>
-          <w:rFonts w:ascii="Consolas" w:hAnsi="Consolas"/>
-          <w:sz w:val="19"/>
-        </w:rPr>
-        <w:t>192.168.175.x</w:t>
-      </w:r>
-      <w:r>
-        <w:t xml:space="preserve">). C'est </w:t>
-      </w:r>
-      <w:r>
-        <w:rPr>
-          <w:b/>
-        </w:rPr>
-        <w:t>cette IP que tu donneras au prompt `public_ip` de l'étape 5</w:t>
-      </w:r>
-      <w:r>
-        <w:t xml:space="preserve"> et que tu mettras dans le fichier </w:t>
-      </w:r>
-      <w:r>
-        <w:rPr>
-          <w:rFonts w:ascii="Consolas" w:hAnsi="Consolas"/>
-          <w:sz w:val="19"/>
-        </w:rPr>
-        <w:t>hosts</w:t>
-      </w:r>
-      <w:r>
-        <w:t xml:space="preserve"> Windows.</w:t>
+        <w:t>bash scripts/standalone-prep.sh dev</w:t>
       </w:r>
     </w:p>
     <w:p>
@@ -619,85 +1357,56 @@
         <w:ind w:left="360" w:right="144"/>
       </w:pPr>
       <w:r>
-        <w:t xml:space="preserve">⚠️ Ne </w:t>
+        <w:t xml:space="preserve">⚠️ Utiliser </w:t>
       </w:r>
       <w:r>
         <w:rPr>
           <w:b/>
         </w:rPr>
-        <w:t>jamais</w:t>
-      </w:r>
-      <w:r>
-        <w:t xml:space="preserve"> réutiliser </w:t>
+        <w:t>`bash scripts/...`</w:t>
+      </w:r>
+      <w:r>
+        <w:t xml:space="preserve"> et non </w:t>
       </w:r>
       <w:r>
         <w:rPr>
           <w:rFonts w:ascii="Consolas" w:hAnsi="Consolas"/>
           <w:sz w:val="19"/>
         </w:rPr>
-        <w:t>tioukh</w:t>
-      </w:r>
-      <w:r>
-        <w:t xml:space="preserve"> (déjà rattaché à un autre serveur). Le sous-domaine sera : </w:t>
+        <w:t>./scripts/...</w:t>
+      </w:r>
+      <w:r>
+        <w:t xml:space="preserve"> (pas de permission d'exécution sur les fichiers clonés → </w:t>
       </w:r>
       <w:r>
         <w:rPr>
           <w:rFonts w:ascii="Consolas" w:hAnsi="Consolas"/>
           <w:sz w:val="19"/>
         </w:rPr>
-        <w:t>moninfra.duckdns.org</w:t>
-      </w:r>
-      <w:r>
-        <w:t>.</w:t>
-      </w:r>
-    </w:p>
-    <w:p>
-      <w:pPr>
-        <w:pStyle w:val="Heading2"/>
-      </w:pPr>
-      <w:r>
-        <w:t>5. Préparation automatique du serveur</w:t>
-      </w:r>
-    </w:p>
-    <w:p>
-      <w:r>
-        <w:t xml:space="preserve">Le script </w:t>
+        <w:t>Permission denied</w:t>
+      </w:r>
+      <w:r>
+        <w:t xml:space="preserve">). Ne pas utiliser </w:t>
       </w:r>
       <w:r>
         <w:rPr>
           <w:rFonts w:ascii="Consolas" w:hAnsi="Consolas"/>
           <w:sz w:val="19"/>
         </w:rPr>
-        <w:t>standalone-prep.sh</w:t>
-      </w:r>
-      <w:r>
-        <w:t xml:space="preserve"> installe Ansible + les collections Docker,</w:t>
-      </w:r>
-    </w:p>
-    <w:p>
-      <w:r>
-        <w:t>crée l'inventaire local, copie les fichiers de secrets/variables depuis les</w:t>
-      </w:r>
-    </w:p>
-    <w:p>
-      <w:r>
-        <w:t>exemples et génère le mot de passe vault.</w:t>
-      </w:r>
-    </w:p>
-    <w:p>
-      <w:pPr>
-        <w:pStyle w:val="CodeBlock"/>
-      </w:pPr>
-      <w:r>
-        <w:t>cd infra-deploie</w:t>
-      </w:r>
-    </w:p>
-    <w:p>
-      <w:pPr>
-        <w:pStyle w:val="CodeBlock"/>
-      </w:pPr>
-      <w:r>
-        <w:t>scripts/standalone-prep.sh dev</w:t>
+        <w:t>sudo</w:t>
+      </w:r>
+      <w:r>
+        <w:t xml:space="preserve"> (le script fait déjà ses </w:t>
+      </w:r>
+      <w:r>
+        <w:rPr>
+          <w:rFonts w:ascii="Consolas" w:hAnsi="Consolas"/>
+          <w:sz w:val="19"/>
+        </w:rPr>
+        <w:t>sudo</w:t>
+      </w:r>
+      <w:r>
+        <w:t xml:space="preserve"> ; l'exécuter en root créerait des fichiers mal propriétaires).</w:t>
       </w:r>
     </w:p>
     <w:p>
@@ -826,14 +1535,17 @@
           </w:tcPr>
           <w:p>
             <w:r>
-              <w:t xml:space="preserve">ex : </w:t>
+              <w:t xml:space="preserve">un identifiant (ex : </w:t>
             </w:r>
             <w:r>
               <w:rPr>
                 <w:rFonts w:ascii="Consolas" w:hAnsi="Consolas"/>
                 <w:sz w:val="19"/>
               </w:rPr>
-              <w:t>monvps</w:t>
+              <w:t>vps4</w:t>
+            </w:r>
+            <w:r>
+              <w:t>)</w:t>
             </w:r>
           </w:p>
         </w:tc>
@@ -862,10 +1574,10 @@
               <w:rPr>
                 <w:b/>
               </w:rPr>
-              <w:t>l'IP LAN de la VM</w:t>
+              <w:t>l'IP LAN du serveur</w:t>
             </w:r>
             <w:r>
-              <w:t xml:space="preserve"> (vue depuis ton poste Windows, mode Bridged) — PAS l'IP publique (le cron DuckDNS s'occupe de l'IP publique tout seul)</w:t>
+              <w:t xml:space="preserve"> (vue depuis le poste Windows) — PAS l'IP publique</w:t>
             </w:r>
           </w:p>
         </w:tc>
@@ -891,14 +1603,14 @@
           </w:tcPr>
           <w:p>
             <w:r>
-              <w:t xml:space="preserve">le compte SSH administrateur (ex : </w:t>
+              <w:t xml:space="preserve">le compte SSH admin (ex : </w:t>
             </w:r>
             <w:r>
               <w:rPr>
                 <w:rFonts w:ascii="Consolas" w:hAnsi="Consolas"/>
                 <w:sz w:val="19"/>
               </w:rPr>
-              <w:t>ubuntu</w:t>
+              <w:t>diouf</w:t>
             </w:r>
             <w:r>
               <w:t>)</w:t>
@@ -937,7 +1649,33 @@
               <w:t>sudo</w:t>
             </w:r>
             <w:r>
-              <w:t xml:space="preserve"> de ce compte</w:t>
+              <w:t xml:space="preserve"> de ce compte (vide si NOPASSWD)</w:t>
+            </w:r>
+          </w:p>
+        </w:tc>
+      </w:tr>
+      <w:tr>
+        <w:tc>
+          <w:tcPr>
+            <w:tcW w:type="dxa" w:w="4320"/>
+          </w:tcPr>
+          <w:p>
+            <w:r>
+              <w:rPr>
+                <w:rFonts w:ascii="Consolas" w:hAnsi="Consolas"/>
+                <w:sz w:val="19"/>
+              </w:rPr>
+              <w:t>private_ip</w:t>
+            </w:r>
+          </w:p>
+        </w:tc>
+        <w:tc>
+          <w:tcPr>
+            <w:tcW w:type="dxa" w:w="4320"/>
+          </w:tcPr>
+          <w:p>
+            <w:r>
+              <w:t>⏎ (défaut = public_ip)</w:t>
             </w:r>
           </w:p>
         </w:tc>
@@ -959,7 +1697,39 @@
           </w:tcPr>
           <w:p>
             <w:r>
-              <w:t>laisser vide pour en générer un (affiché une fois)</w:t>
+              <w:t xml:space="preserve">⏎ pour en générer un — </w:t>
+            </w:r>
+            <w:r>
+              <w:rPr>
+                <w:b/>
+              </w:rPr>
+              <w:t>il est affiché, note-le</w:t>
+            </w:r>
+          </w:p>
+        </w:tc>
+      </w:tr>
+      <w:tr>
+        <w:tc>
+          <w:tcPr>
+            <w:tcW w:type="dxa" w:w="4320"/>
+          </w:tcPr>
+          <w:p>
+            <w:r>
+              <w:t>Chiffrer le vault ?</w:t>
+            </w:r>
+          </w:p>
+        </w:tc>
+        <w:tc>
+          <w:tcPr>
+            <w:tcW w:type="dxa" w:w="4320"/>
+          </w:tcPr>
+          <w:p>
+            <w:r>
+              <w:rPr>
+                <w:rFonts w:ascii="Consolas" w:hAnsi="Consolas"/>
+                <w:sz w:val="19"/>
+              </w:rPr>
+              <w:t>y</w:t>
             </w:r>
           </w:p>
         </w:tc>
@@ -971,50 +1741,239 @@
       </w:pPr>
     </w:p>
     <w:p>
-      <w:pPr>
-        <w:ind w:left="360" w:right="144"/>
-      </w:pPr>
       <w:r>
         <w:rPr>
           <w:b/>
         </w:rPr>
-        <w:t>VM VMware</w:t>
-      </w:r>
-      <w:r>
-        <w:t xml:space="preserve"> : placer la VM sur le réseau </w:t>
-      </w:r>
+        <w:t>Gestion des pièges Ubuntu 24.04 (déjà traitée par le script) :</w:t>
+      </w:r>
+    </w:p>
+    <w:p>
+      <w:pPr>
+        <w:pStyle w:val="ListBullet"/>
+      </w:pPr>
       <w:r>
         <w:rPr>
           <w:b/>
         </w:rPr>
-        <w:t>Bridged</w:t>
-      </w:r>
-      <w:r>
-        <w:t xml:space="preserve"> (elle a alors une IP de ton LAN et est joignable par les autres machines). En </w:t>
-      </w:r>
-      <w:r>
-        <w:rPr>
-          <w:b/>
-        </w:rPr>
-        <w:t>NAT</w:t>
-      </w:r>
-      <w:r>
-        <w:t xml:space="preserve">, elle n'est joignable que depuis l'hôte Windows — fonctionnel pour tester depuis ton poste uniquement. IP fixe recommandée (ou réservation DHCP dans VMware), sinon le fichier </w:t>
+        <w:t>PEP 668</w:t>
+      </w:r>
+      <w:r>
+        <w:t xml:space="preserve"> : si </w:t>
       </w:r>
       <w:r>
         <w:rPr>
           <w:rFonts w:ascii="Consolas" w:hAnsi="Consolas"/>
           <w:sz w:val="19"/>
         </w:rPr>
-        <w:t>hosts</w:t>
-      </w:r>
-      <w:r>
-        <w:t xml:space="preserve"> casse après un reboot.</w:t>
+        <w:t>pip</w:t>
+      </w:r>
+      <w:r>
+        <w:t xml:space="preserve"> refuse l'installation (</w:t>
+      </w:r>
+      <w:r>
+        <w:rPr>
+          <w:rFonts w:ascii="Consolas" w:hAnsi="Consolas"/>
+          <w:sz w:val="19"/>
+        </w:rPr>
+        <w:t>externally-managed-environment</w:t>
+      </w:r>
+      <w:r>
+        <w:t>),</w:t>
       </w:r>
     </w:p>
     <w:p>
       <w:r>
-        <w:t>À la fin, le script affiche les étapes restantes (édition des fichiers).</w:t>
+        <w:t xml:space="preserve">  le script retente automatiquement avec </w:t>
+      </w:r>
+      <w:r>
+        <w:rPr>
+          <w:rFonts w:ascii="Consolas" w:hAnsi="Consolas"/>
+          <w:sz w:val="19"/>
+        </w:rPr>
+        <w:t>--break-system-packages</w:t>
+      </w:r>
+      <w:r>
+        <w:t>. Si pour une</w:t>
+      </w:r>
+    </w:p>
+    <w:p>
+      <w:r>
+        <w:t xml:space="preserve">  raison quelconque Ansible n'est pas installé à la fin, le faire à la main :</w:t>
+      </w:r>
+    </w:p>
+    <w:p>
+      <w:pPr>
+        <w:pStyle w:val="CodeBlock"/>
+      </w:pPr>
+      <w:r>
+        <w:t xml:space="preserve">  python3 -m pip install --user --break-system-packages ansible-core</w:t>
+      </w:r>
+    </w:p>
+    <w:p>
+      <w:pPr>
+        <w:pStyle w:val="CodeBlock"/>
+      </w:pPr>
+      <w:r>
+        <w:t xml:space="preserve">  export PATH="$HOME/.local/bin:$PATH"</w:t>
+      </w:r>
+    </w:p>
+    <w:p>
+      <w:pPr>
+        <w:pStyle w:val="ListBullet"/>
+      </w:pPr>
+      <w:r>
+        <w:rPr>
+          <w:b/>
+        </w:rPr>
+        <w:t>Collections</w:t>
+      </w:r>
+      <w:r>
+        <w:t xml:space="preserve"> : le script vérifie la </w:t>
+      </w:r>
+      <w:r>
+        <w:rPr>
+          <w:b/>
+        </w:rPr>
+        <w:t>présence effective</w:t>
+      </w:r>
+      <w:r>
+        <w:t xml:space="preserve"> des dossiers</w:t>
+      </w:r>
+    </w:p>
+    <w:p>
+      <w:r>
+        <w:t xml:space="preserve">  </w:t>
+      </w:r>
+      <w:r>
+        <w:rPr>
+          <w:rFonts w:ascii="Consolas" w:hAnsi="Consolas"/>
+          <w:sz w:val="19"/>
+        </w:rPr>
+        <w:t>community/docker</w:t>
+      </w:r>
+      <w:r>
+        <w:t xml:space="preserve"> et </w:t>
+      </w:r>
+      <w:r>
+        <w:rPr>
+          <w:rFonts w:ascii="Consolas" w:hAnsi="Consolas"/>
+          <w:sz w:val="19"/>
+        </w:rPr>
+        <w:t>community/general</w:t>
+      </w:r>
+      <w:r>
+        <w:t>. S'ils manquent, il lance</w:t>
+      </w:r>
+    </w:p>
+    <w:p>
+      <w:r>
+        <w:t xml:space="preserve">  </w:t>
+      </w:r>
+      <w:r>
+        <w:rPr>
+          <w:rFonts w:ascii="Consolas" w:hAnsi="Consolas"/>
+          <w:sz w:val="19"/>
+        </w:rPr>
+        <w:t>ansible-galaxy collection install -r ansible/requirements.yml</w:t>
+      </w:r>
+      <w:r>
+        <w:t>.</w:t>
+      </w:r>
+    </w:p>
+    <w:p>
+      <w:pPr>
+        <w:pStyle w:val="ListBullet"/>
+      </w:pPr>
+      <w:r>
+        <w:rPr>
+          <w:b/>
+        </w:rPr>
+        <w:t>PATH</w:t>
+      </w:r>
+      <w:r>
+        <w:t xml:space="preserve"> : le script ajoute </w:t>
+      </w:r>
+      <w:r>
+        <w:rPr>
+          <w:rFonts w:ascii="Consolas" w:hAnsi="Consolas"/>
+          <w:sz w:val="19"/>
+        </w:rPr>
+        <w:t>$HOME/.local/bin</w:t>
+      </w:r>
+      <w:r>
+        <w:t xml:space="preserve"> à </w:t>
+      </w:r>
+      <w:r>
+        <w:rPr>
+          <w:rFonts w:ascii="Consolas" w:hAnsi="Consolas"/>
+          <w:sz w:val="19"/>
+        </w:rPr>
+        <w:t>~/.bashrc</w:t>
+      </w:r>
+      <w:r>
+        <w:t xml:space="preserve"> pour que </w:t>
+      </w:r>
+      <w:r>
+        <w:rPr>
+          <w:rFonts w:ascii="Consolas" w:hAnsi="Consolas"/>
+          <w:sz w:val="19"/>
+        </w:rPr>
+        <w:t>make</w:t>
+      </w:r>
+    </w:p>
+    <w:p>
+      <w:r>
+        <w:t xml:space="preserve">  trouve </w:t>
+      </w:r>
+      <w:r>
+        <w:rPr>
+          <w:rFonts w:ascii="Consolas" w:hAnsi="Consolas"/>
+          <w:sz w:val="19"/>
+        </w:rPr>
+        <w:t>ansible-playbook</w:t>
+      </w:r>
+      <w:r>
+        <w:t xml:space="preserve"> dans les sessions futures (toujours </w:t>
+      </w:r>
+      <w:r>
+        <w:rPr>
+          <w:rFonts w:ascii="Consolas" w:hAnsi="Consolas"/>
+          <w:sz w:val="19"/>
+        </w:rPr>
+        <w:t>export PATH="$HOME/.local/bin:$PATH"</w:t>
+      </w:r>
+      <w:r>
+        <w:t xml:space="preserve"> dans la session courante si besoin).</w:t>
+      </w:r>
+    </w:p>
+    <w:p>
+      <w:r>
+        <w:t>Vérifier en fin de script :</w:t>
+      </w:r>
+    </w:p>
+    <w:p>
+      <w:pPr>
+        <w:pStyle w:val="CodeBlock"/>
+      </w:pPr>
+      <w:r>
+        <w:t>ansible-playbook --version | head -1</w:t>
+      </w:r>
+    </w:p>
+    <w:p>
+      <w:pPr>
+        <w:pStyle w:val="CodeBlock"/>
+      </w:pPr>
+      <w:r>
+        <w:t>ansible-galaxy collection list community.docker</w:t>
+      </w:r>
+    </w:p>
+    <w:p>
+      <w:pPr>
+        <w:pStyle w:val="CodeBlock"/>
+      </w:pPr>
+      <w:r>
+        <w:t>ansible-galaxy collection list community.general</w:t>
       </w:r>
     </w:p>
     <w:p>
@@ -1022,25 +1981,25 @@
         <w:pStyle w:val="Heading2"/>
       </w:pPr>
       <w:r>
-        <w:t>6. Renseigner SES variables (fichiers locaux, jamais commités)</w:t>
-      </w:r>
-    </w:p>
-    <w:p>
-      <w:pPr>
-        <w:pStyle w:val="Heading3"/>
-      </w:pPr>
-      <w:r>
-        <w:t xml:space="preserve">6.1 </w:t>
+        <w:t>B.5 — Variables spécifiques au serveur (</w:t>
       </w:r>
       <w:r>
         <w:rPr>
           <w:rFonts w:ascii="Consolas" w:hAnsi="Consolas"/>
           <w:sz w:val="19"/>
         </w:rPr>
-        <w:t>ansible/group_vars/server_vars.yml</w:t>
-      </w:r>
-      <w:r>
-        <w:t xml:space="preserve"> — le domaine</w:t>
+        <w:t>server_vars.yml</w:t>
+      </w:r>
+      <w:r>
+        <w:t>)</w:t>
+      </w:r>
+    </w:p>
+    <w:p>
+      <w:r>
+        <w:rPr>
+          <w:b/>
+        </w:rPr>
+        <w:t>serveur</w:t>
       </w:r>
     </w:p>
     <w:p>
@@ -1053,7 +2012,7 @@
     </w:p>
     <w:p>
       <w:r>
-        <w:t>Décommenter et renseigner (le reste peut rester en commentaire) :</w:t>
+        <w:t>Renseigner au minimum :</w:t>
       </w:r>
     </w:p>
     <w:p>
@@ -1061,7 +2020,7 @@
         <w:pStyle w:val="CodeBlock"/>
       </w:pPr>
       <w:r>
-        <w:t>infra_domain: "moninfra.duckdns.org"</w:t>
+        <w:t>infra_domain: "&lt;votre-sous-domaine&gt;.duckdns.org"</w:t>
       </w:r>
     </w:p>
     <w:p>
@@ -1069,7 +2028,7 @@
         <w:pStyle w:val="CodeBlock"/>
       </w:pPr>
       <w:r>
-        <w:t>duckdns_domains: "moninfra"</w:t>
+        <w:t>duckdns_domains: "&lt;votre-sous-domaine&gt;"</w:t>
       </w:r>
     </w:p>
     <w:p>
@@ -1077,7 +2036,232 @@
         <w:pStyle w:val="CodeBlock"/>
       </w:pPr>
       <w:r>
-        <w:t>app_deploy_user: "papa"</w:t>
+        <w:t>app_deploy_user: "&lt;votre-compte-ssh-local&gt;"</w:t>
+      </w:r>
+    </w:p>
+    <w:p>
+      <w:pPr>
+        <w:ind w:left="360" w:right="144"/>
+      </w:pPr>
+      <w:r>
+        <w:rPr>
+          <w:rFonts w:ascii="Consolas" w:hAnsi="Consolas"/>
+          <w:sz w:val="19"/>
+        </w:rPr>
+        <w:t>app_deploy_user</w:t>
+      </w:r>
+      <w:r>
+        <w:t xml:space="preserve"> = l'utilisateur </w:t>
+      </w:r>
+      <w:r>
+        <w:rPr>
+          <w:b/>
+        </w:rPr>
+        <w:t>local</w:t>
+      </w:r>
+      <w:r>
+        <w:t xml:space="preserve"> qui possédera </w:t>
+      </w:r>
+      <w:r>
+        <w:rPr>
+          <w:rFonts w:ascii="Consolas" w:hAnsi="Consolas"/>
+          <w:sz w:val="19"/>
+        </w:rPr>
+        <w:t>/opt/apps</w:t>
+      </w:r>
+      <w:r>
+        <w:t xml:space="preserve"> et les clés de déploiement CI/CD. Utiliser </w:t>
+      </w:r>
+      <w:r>
+        <w:rPr>
+          <w:b/>
+        </w:rPr>
+        <w:t>son propre compte</w:t>
+      </w:r>
+      <w:r>
+        <w:t xml:space="preserve"> (ex : </w:t>
+      </w:r>
+      <w:r>
+        <w:rPr>
+          <w:rFonts w:ascii="Consolas" w:hAnsi="Consolas"/>
+          <w:sz w:val="19"/>
+        </w:rPr>
+        <w:t>diouf</w:t>
+      </w:r>
+      <w:r>
+        <w:t xml:space="preserve">) — jamais </w:t>
+      </w:r>
+      <w:r>
+        <w:rPr>
+          <w:rFonts w:ascii="Consolas" w:hAnsi="Consolas"/>
+          <w:sz w:val="19"/>
+        </w:rPr>
+        <w:t>papa</w:t>
+      </w:r>
+      <w:r>
+        <w:t xml:space="preserve"> (compte de la VM de référence, qui n'existe pas ailleurs). Ce rôle (</w:t>
+      </w:r>
+      <w:r>
+        <w:rPr>
+          <w:rFonts w:ascii="Consolas" w:hAnsi="Consolas"/>
+          <w:sz w:val="19"/>
+        </w:rPr>
+        <w:t>app_deploy</w:t>
+      </w:r>
+      <w:r>
+        <w:t xml:space="preserve">) </w:t>
+      </w:r>
+      <w:r>
+        <w:rPr>
+          <w:b/>
+        </w:rPr>
+        <w:t>n'est pas lancé par `make configure`</w:t>
+      </w:r>
+      <w:r>
+        <w:t xml:space="preserve"> (playbook séparé) : aucun impact immédiat.</w:t>
+      </w:r>
+    </w:p>
+    <w:p>
+      <w:r>
+        <w:t xml:space="preserve">Sauvegarder : </w:t>
+      </w:r>
+      <w:r>
+        <w:rPr>
+          <w:b/>
+        </w:rPr>
+        <w:t>Ctrl+O</w:t>
+      </w:r>
+      <w:r>
+        <w:t xml:space="preserve"> → </w:t>
+      </w:r>
+      <w:r>
+        <w:rPr>
+          <w:b/>
+        </w:rPr>
+        <w:t>Entrée</w:t>
+      </w:r>
+      <w:r>
+        <w:t xml:space="preserve"> → </w:t>
+      </w:r>
+      <w:r>
+        <w:rPr>
+          <w:b/>
+        </w:rPr>
+        <w:t>Ctrl+X</w:t>
+      </w:r>
+      <w:r>
+        <w:t>.</w:t>
+      </w:r>
+    </w:p>
+    <w:p>
+      <w:r>
+        <w:t xml:space="preserve">Ne pas commiter ce fichier (déjà dans </w:t>
+      </w:r>
+      <w:r>
+        <w:rPr>
+          <w:rFonts w:ascii="Consolas" w:hAnsi="Consolas"/>
+          <w:sz w:val="19"/>
+        </w:rPr>
+        <w:t>.gitignore</w:t>
+      </w:r>
+      <w:r>
+        <w:t>).</w:t>
+      </w:r>
+    </w:p>
+    <w:p>
+      <w:pPr>
+        <w:pStyle w:val="Heading2"/>
+      </w:pPr>
+      <w:r>
+        <w:t>B.6 — Secrets dans le vault (</w:t>
+      </w:r>
+      <w:r>
+        <w:rPr>
+          <w:rFonts w:ascii="Consolas" w:hAnsi="Consolas"/>
+          <w:sz w:val="19"/>
+        </w:rPr>
+        <w:t>vault.yml</w:t>
+      </w:r>
+      <w:r>
+        <w:t>)</w:t>
+      </w:r>
+    </w:p>
+    <w:p>
+      <w:r>
+        <w:t xml:space="preserve">Le script a </w:t>
+      </w:r>
+      <w:r>
+        <w:rPr>
+          <w:b/>
+        </w:rPr>
+        <w:t>déjà chiffré</w:t>
+      </w:r>
+      <w:r>
+        <w:t xml:space="preserve"> </w:t>
+      </w:r>
+      <w:r>
+        <w:rPr>
+          <w:rFonts w:ascii="Consolas" w:hAnsi="Consolas"/>
+          <w:sz w:val="19"/>
+        </w:rPr>
+        <w:t>vault.yml</w:t>
+      </w:r>
+      <w:r>
+        <w:t>. Pour l'éditer, on passe par</w:t>
+      </w:r>
+    </w:p>
+    <w:p>
+      <w:r>
+        <w:rPr>
+          <w:rFonts w:ascii="Consolas" w:hAnsi="Consolas"/>
+          <w:sz w:val="19"/>
+        </w:rPr>
+        <w:t>ansible-vault edit</w:t>
+      </w:r>
+      <w:r>
+        <w:t xml:space="preserve"> (jamais </w:t>
+      </w:r>
+      <w:r>
+        <w:rPr>
+          <w:rFonts w:ascii="Consolas" w:hAnsi="Consolas"/>
+          <w:sz w:val="19"/>
+        </w:rPr>
+        <w:t>nano</w:t>
+      </w:r>
+      <w:r>
+        <w:t xml:space="preserve"> direct, qui afficherait du bruit chiffré ;</w:t>
+      </w:r>
+    </w:p>
+    <w:p>
+      <w:r>
+        <w:t xml:space="preserve">et </w:t>
+      </w:r>
+      <w:r>
+        <w:rPr>
+          <w:b/>
+        </w:rPr>
+        <w:t>ne pas relancer</w:t>
+      </w:r>
+      <w:r>
+        <w:t xml:space="preserve"> </w:t>
+      </w:r>
+      <w:r>
+        <w:rPr>
+          <w:rFonts w:ascii="Consolas" w:hAnsi="Consolas"/>
+          <w:sz w:val="19"/>
+        </w:rPr>
+        <w:t>ansible-vault encrypt</w:t>
+      </w:r>
+      <w:r>
+        <w:t>, le fichier l'est déjà).</w:t>
+      </w:r>
+    </w:p>
+    <w:p>
+      <w:r>
+        <w:rPr>
+          <w:b/>
+        </w:rPr>
+        <w:t>serveur</w:t>
       </w:r>
     </w:p>
     <w:p>
@@ -1085,7 +2269,7 @@
         <w:pStyle w:val="CodeBlock"/>
       </w:pPr>
       <w:r>
-        <w:t>timezone: "Europe/Paris"</w:t>
+        <w:t>EDITOR=nano ansible-vault edit --vault-password-file .vault-pass ansible/group_vars/vault.yml</w:t>
       </w:r>
     </w:p>
     <w:p>
@@ -1093,88 +2277,76 @@
         <w:ind w:left="360" w:right="144"/>
       </w:pPr>
       <w:r>
-        <w:t xml:space="preserve">Tous les hostnames en découlent : </w:t>
-      </w:r>
-      <w:r>
         <w:rPr>
           <w:rFonts w:ascii="Consolas" w:hAnsi="Consolas"/>
           <w:sz w:val="19"/>
         </w:rPr>
-        <w:t>grafana.moninfra.duckdns.org</w:t>
-      </w:r>
-      <w:r>
-        <w:t xml:space="preserve">, </w:t>
+        <w:t>EDITOR=nano</w:t>
+      </w:r>
+      <w:r>
+        <w:t xml:space="preserve"> est </w:t>
+      </w:r>
+      <w:r>
+        <w:rPr>
+          <w:b/>
+        </w:rPr>
+        <w:t>important</w:t>
+      </w:r>
+      <w:r>
+        <w:t xml:space="preserve"> : par défaut Ansible peut ouvrir </w:t>
       </w:r>
       <w:r>
         <w:rPr>
           <w:rFonts w:ascii="Consolas" w:hAnsi="Consolas"/>
           <w:sz w:val="19"/>
         </w:rPr>
-        <w:t>prometheus.moninfra.duckdns.org</w:t>
-      </w:r>
-      <w:r>
-        <w:t xml:space="preserve">, </w:t>
+        <w:t>vi</w:t>
+      </w:r>
+      <w:r>
+        <w:t xml:space="preserve">, sur lequel on ne peut pas taper directement (mode navigation). Avec </w:t>
       </w:r>
       <w:r>
         <w:rPr>
           <w:rFonts w:ascii="Consolas" w:hAnsi="Consolas"/>
           <w:sz w:val="19"/>
         </w:rPr>
-        <w:t>traefik.moninfra.duckdns.org</w:t>
-      </w:r>
-      <w:r>
-        <w:t xml:space="preserve">, </w:t>
+        <w:t>nano</w:t>
+      </w:r>
+      <w:r>
+        <w:t xml:space="preserve">, on écrit comme un bloc-notes : </w:t>
+      </w:r>
+      <w:r>
+        <w:rPr>
+          <w:b/>
+        </w:rPr>
+        <w:t>Ctrl+O</w:t>
+      </w:r>
+      <w:r>
+        <w:t xml:space="preserve"> sauve, </w:t>
+      </w:r>
+      <w:r>
+        <w:rPr>
+          <w:b/>
+        </w:rPr>
+        <w:t>Ctrl+X</w:t>
+      </w:r>
+      <w:r>
+        <w:t xml:space="preserve"> quitte, Ansible rechiffre automatiquement.</w:t>
+      </w:r>
+    </w:p>
+    <w:p>
+      <w:r>
+        <w:t xml:space="preserve">Remplacer les </w:t>
       </w:r>
       <w:r>
         <w:rPr>
           <w:rFonts w:ascii="Consolas" w:hAnsi="Consolas"/>
           <w:sz w:val="19"/>
         </w:rPr>
-        <w:t>whoami.moninfra.duckdns.org</w:t>
-      </w:r>
-      <w:r>
-        <w:t xml:space="preserve">, </w:t>
-      </w:r>
-      <w:r>
-        <w:rPr>
-          <w:rFonts w:ascii="Consolas" w:hAnsi="Consolas"/>
-          <w:sz w:val="19"/>
-        </w:rPr>
-        <w:t>sonar.moninfra.duckdns.org</w:t>
-      </w:r>
-      <w:r>
-        <w:t>.</w:t>
-      </w:r>
-    </w:p>
-    <w:p>
-      <w:pPr>
-        <w:pStyle w:val="Heading3"/>
-      </w:pPr>
-      <w:r>
-        <w:t xml:space="preserve">6.2 </w:t>
-      </w:r>
-      <w:r>
-        <w:rPr>
-          <w:rFonts w:ascii="Consolas" w:hAnsi="Consolas"/>
-          <w:sz w:val="19"/>
-        </w:rPr>
-        <w:t>ansible/group_vars/vault.yml</w:t>
-      </w:r>
-      <w:r>
-        <w:t xml:space="preserve"> — les secrets</w:t>
-      </w:r>
-    </w:p>
-    <w:p>
-      <w:pPr>
-        <w:pStyle w:val="CodeBlock"/>
-      </w:pPr>
-      <w:r>
-        <w:t>nano ansible/group_vars/vault.yml</w:t>
-      </w:r>
-    </w:p>
-    <w:p>
-      <w:r>
-        <w:t>Renseigner au minimum :</w:t>
+        <w:t>CHANGE-ME</w:t>
+      </w:r>
+      <w:r>
+        <w:t xml:space="preserve"> :</w:t>
       </w:r>
     </w:p>
     <w:tbl>
@@ -1285,14 +2457,14 @@
           </w:tcPr>
           <w:p>
             <w:r>
-              <w:t>hash bcrypt du mdp Prometheus (</w:t>
+              <w:t>hash bcrypt (</w:t>
             </w:r>
             <w:r>
               <w:rPr>
                 <w:rFonts w:ascii="Consolas" w:hAnsi="Consolas"/>
                 <w:sz w:val="19"/>
               </w:rPr>
-              <w:t>scripts/gen-bcrypt-hash.sh</w:t>
+              <w:t>scripts/gen-bcrypt-hash.sh "mdp"</w:t>
             </w:r>
             <w:r>
               <w:t>)</w:t>
@@ -1337,7 +2509,7 @@
                 <w:rFonts w:ascii="Consolas" w:hAnsi="Consolas"/>
                 <w:sz w:val="19"/>
               </w:rPr>
-              <w:t>sonarqube_admin_new_password</w:t>
+              <w:t>sonarqube_*</w:t>
             </w:r>
           </w:p>
         </w:tc>
@@ -1347,7 +2519,7 @@
           </w:tcPr>
           <w:p>
             <w:r>
-              <w:t>(si SonarQube activé)</w:t>
+              <w:t>à personnaliser (SonarQube désactivé en dev par défaut)</w:t>
             </w:r>
           </w:p>
         </w:tc>
@@ -1363,7 +2535,7 @@
                 <w:rFonts w:ascii="Consolas" w:hAnsi="Consolas"/>
                 <w:sz w:val="19"/>
               </w:rPr>
-              <w:t>sonarqube_db_password</w:t>
+              <w:t>alerting.email.smtp_password</w:t>
             </w:r>
           </w:p>
         </w:tc>
@@ -1373,7 +2545,69 @@
           </w:tcPr>
           <w:p>
             <w:r>
-              <w:t>(si SonarQube activé)</w:t>
+              <w:t>mot de passe d'application Gmail (2FA)</w:t>
+            </w:r>
+          </w:p>
+        </w:tc>
+      </w:tr>
+      <w:tr>
+        <w:tc>
+          <w:tcPr>
+            <w:tcW w:type="dxa" w:w="4320"/>
+          </w:tcPr>
+          <w:p>
+            <w:r>
+              <w:rPr>
+                <w:rFonts w:ascii="Consolas" w:hAnsi="Consolas"/>
+                <w:sz w:val="19"/>
+              </w:rPr>
+              <w:t>alerting.telegram.bot_token</w:t>
+            </w:r>
+            <w:r>
+              <w:t xml:space="preserve"> / </w:t>
+            </w:r>
+            <w:r>
+              <w:rPr>
+                <w:rFonts w:ascii="Consolas" w:hAnsi="Consolas"/>
+                <w:sz w:val="19"/>
+              </w:rPr>
+              <w:t>chat_id</w:t>
+            </w:r>
+          </w:p>
+        </w:tc>
+        <w:tc>
+          <w:tcPr>
+            <w:tcW w:type="dxa" w:w="4320"/>
+          </w:tcPr>
+          <w:p>
+            <w:r>
+              <w:t>(optionnel)</w:t>
+            </w:r>
+          </w:p>
+        </w:tc>
+      </w:tr>
+      <w:tr>
+        <w:tc>
+          <w:tcPr>
+            <w:tcW w:type="dxa" w:w="4320"/>
+          </w:tcPr>
+          <w:p>
+            <w:r>
+              <w:rPr>
+                <w:rFonts w:ascii="Consolas" w:hAnsi="Consolas"/>
+                <w:sz w:val="19"/>
+              </w:rPr>
+              <w:t>alerting.slack.webhook_url</w:t>
+            </w:r>
+          </w:p>
+        </w:tc>
+        <w:tc>
+          <w:tcPr>
+            <w:tcW w:type="dxa" w:w="4320"/>
+          </w:tcPr>
+          <w:p>
+            <w:r>
+              <w:t>(optionnel)</w:t>
             </w:r>
           </w:p>
         </w:tc>
@@ -1402,33 +2636,7 @@
               <w:rPr>
                 <w:b/>
               </w:rPr>
-              <w:t>le token du sous-domaine créé à l'étape 4</w:t>
-            </w:r>
-          </w:p>
-        </w:tc>
-      </w:tr>
-      <w:tr>
-        <w:tc>
-          <w:tcPr>
-            <w:tcW w:type="dxa" w:w="4320"/>
-          </w:tcPr>
-          <w:p>
-            <w:r>
-              <w:rPr>
-                <w:rFonts w:ascii="Consolas" w:hAnsi="Consolas"/>
-                <w:sz w:val="19"/>
-              </w:rPr>
-              <w:t>alerting.*</w:t>
-            </w:r>
-          </w:p>
-        </w:tc>
-        <w:tc>
-          <w:tcPr>
-            <w:tcW w:type="dxa" w:w="4320"/>
-          </w:tcPr>
-          <w:p>
-            <w:r>
-              <w:t>e-mail / Telegram / Slack (optionnel)</w:t>
+              <w:t>le token du sous-domaine DuckDNS (B.3)</w:t>
             </w:r>
           </w:p>
         </w:tc>
@@ -1440,8 +2648,63 @@
       </w:pPr>
     </w:p>
     <w:p>
-      <w:r>
-        <w:t>Générer les hash bcrypt :</w:t>
+      <w:pPr>
+        <w:ind w:left="360" w:right="144"/>
+      </w:pPr>
+      <w:r>
+        <w:t xml:space="preserve">⚠️ </w:t>
+      </w:r>
+      <w:r>
+        <w:rPr>
+          <w:b/>
+        </w:rPr>
+        <w:t>YAML strict</w:t>
+      </w:r>
+      <w:r>
+        <w:t xml:space="preserve"> : </w:t>
+      </w:r>
+      <w:r>
+        <w:rPr>
+          <w:rFonts w:ascii="Consolas" w:hAnsi="Consolas"/>
+          <w:sz w:val="19"/>
+        </w:rPr>
+        <w:t>duckdns_token:</w:t>
+      </w:r>
+      <w:r>
+        <w:t xml:space="preserve"> et </w:t>
+      </w:r>
+      <w:r>
+        <w:rPr>
+          <w:rFonts w:ascii="Consolas" w:hAnsi="Consolas"/>
+          <w:sz w:val="19"/>
+        </w:rPr>
+        <w:t>duckdns_domains:</w:t>
+      </w:r>
+      <w:r>
+        <w:t xml:space="preserve"> doivent être à la </w:t>
+      </w:r>
+      <w:r>
+        <w:rPr>
+          <w:b/>
+        </w:rPr>
+        <w:t>colonne 0</w:t>
+      </w:r>
+      <w:r>
+        <w:t xml:space="preserve">, sans espace de début (sinon Ansible refuse de charger le vault). Tous les secrets collés ici vont dans un fichier </w:t>
+      </w:r>
+      <w:r>
+        <w:rPr>
+          <w:b/>
+        </w:rPr>
+        <w:t>chiffré</w:t>
+      </w:r>
+      <w:r>
+        <w:t>.</w:t>
+      </w:r>
+    </w:p>
+    <w:p>
+      <w:r>
+        <w:t>Vérifier le chiffrage :</w:t>
       </w:r>
     </w:p>
     <w:p>
@@ -1449,7 +2712,7 @@
         <w:pStyle w:val="CodeBlock"/>
       </w:pPr>
       <w:r>
-        <w:t># méthode 1 : python3 + bcrypt (sudo apt install -y python3-bcrypt)</w:t>
+        <w:t>head -1 ansible/group_vars/vault.yml            # $ANSIBLE_VAULT;1.1;AES256</w:t>
       </w:r>
     </w:p>
     <w:p>
@@ -1457,7 +2720,23 @@
         <w:pStyle w:val="CodeBlock"/>
       </w:pPr>
       <w:r>
-        <w:t>scripts/gen-bcrypt-hash.sh "mon-mot-de-passe-prometheus"</w:t>
+        <w:t>ansible-vault view --vault-password-file .vault-pass ansible/group_vars/vault.yml | head -3</w:t>
+      </w:r>
+    </w:p>
+    <w:p>
+      <w:pPr>
+        <w:pStyle w:val="Heading2"/>
+      </w:pPr>
+      <w:r>
+        <w:t>B.7 — Déployer</w:t>
+      </w:r>
+    </w:p>
+    <w:p>
+      <w:r>
+        <w:rPr>
+          <w:b/>
+        </w:rPr>
+        <w:t>serveur</w:t>
       </w:r>
     </w:p>
     <w:p>
@@ -1465,7 +2744,12 @@
         <w:pStyle w:val="CodeBlock"/>
       </w:pPr>
       <w:r>
-        <w:t># méthode 2 : htpasswd (sudo apt install -y apache2-utils)</w:t>
+        <w:t>make configure ENV=dev VAULT_ARGS='--vault-password-file ../.vault-pass'</w:t>
+      </w:r>
+    </w:p>
+    <w:p>
+      <w:r>
+        <w:t>Résultat attendu (fin de sortie) :</w:t>
       </w:r>
     </w:p>
     <w:p>
@@ -1473,12 +2757,7 @@
         <w:pStyle w:val="CodeBlock"/>
       </w:pPr>
       <w:r>
-        <w:t>htpasswd -nbB -C 12 user "mon-mot-de-passe"</w:t>
-      </w:r>
-    </w:p>
-    <w:p>
-      <w:r>
-        <w:t>Chiffrer le vault (si le script ne l'a pas fait) :</w:t>
+        <w:t>PLAY RECAP ****************************************</w:t>
       </w:r>
     </w:p>
     <w:p>
@@ -1486,7 +2765,100 @@
         <w:pStyle w:val="CodeBlock"/>
       </w:pPr>
       <w:r>
-        <w:t>ansible-vault encrypt --vault-password-file .vault-pass ansible/group_vars/vault.yml</w:t>
+        <w:t>dev : ok=97 changed=63 unreachable=0 failed=0 skipped=7 ...</w:t>
+      </w:r>
+    </w:p>
+    <w:p>
+      <w:pPr>
+        <w:pStyle w:val="ListBullet"/>
+      </w:pPr>
+      <w:r>
+        <w:t xml:space="preserve">Relançable en cas d'échec : le playbook est </w:t>
+      </w:r>
+      <w:r>
+        <w:rPr>
+          <w:b/>
+        </w:rPr>
+        <w:t>idempotent</w:t>
+      </w:r>
+      <w:r>
+        <w:t>.</w:t>
+      </w:r>
+    </w:p>
+    <w:p>
+      <w:pPr>
+        <w:pStyle w:val="ListBullet"/>
+      </w:pPr>
+      <w:r>
+        <w:t xml:space="preserve">Les certificats Let's Encrypt (wildcard </w:t>
+      </w:r>
+      <w:r>
+        <w:rPr>
+          <w:rFonts w:ascii="Consolas" w:hAnsi="Consolas"/>
+          <w:sz w:val="19"/>
+        </w:rPr>
+        <w:t>*.&lt;sous-domaine&gt;.duckdns.org</w:t>
+      </w:r>
+      <w:r>
+        <w:t>) sont</w:t>
+      </w:r>
+    </w:p>
+    <w:p>
+      <w:r>
+        <w:t xml:space="preserve">  émis automatiquement au premier déploiement (DNS-01 DuckDNS).</w:t>
+      </w:r>
+    </w:p>
+    <w:p>
+      <w:pPr>
+        <w:pStyle w:val="ListBullet"/>
+      </w:pPr>
+      <w:r>
+        <w:t>Si le playbook s'arrête sur *« Missing sudo password »* : le</w:t>
+      </w:r>
+    </w:p>
+    <w:p>
+      <w:r>
+        <w:t xml:space="preserve">  </w:t>
+      </w:r>
+      <w:r>
+        <w:rPr>
+          <w:rFonts w:ascii="Consolas" w:hAnsi="Consolas"/>
+          <w:sz w:val="19"/>
+        </w:rPr>
+        <w:t>ansible_become_password</w:t>
+      </w:r>
+      <w:r>
+        <w:t xml:space="preserve"> de l'inventaire est vide → remplir </w:t>
+      </w:r>
+      <w:r>
+        <w:rPr>
+          <w:rFonts w:ascii="Consolas" w:hAnsi="Consolas"/>
+          <w:sz w:val="19"/>
+        </w:rPr>
+        <w:t>hosts.ini</w:t>
+      </w:r>
+      <w:r>
+        <w:t xml:space="preserve"> ou</w:t>
+      </w:r>
+    </w:p>
+    <w:p>
+      <w:r>
+        <w:t xml:space="preserve">  lancer </w:t>
+      </w:r>
+      <w:r>
+        <w:rPr>
+          <w:rFonts w:ascii="Consolas" w:hAnsi="Consolas"/>
+          <w:sz w:val="19"/>
+        </w:rPr>
+        <w:t>make configure ENV=dev VAULT_ARGS='...' --ask-become-pass</w:t>
+      </w:r>
+      <w:r>
+        <w:t xml:space="preserve"> (saisir le</w:t>
+      </w:r>
+    </w:p>
+    <w:p>
+      <w:r>
+        <w:t xml:space="preserve">  mdp sudo).</w:t>
       </w:r>
     </w:p>
     <w:p>
@@ -1494,7 +2866,15 @@
         <w:pStyle w:val="Heading2"/>
       </w:pPr>
       <w:r>
-        <w:t>7. Déployer</w:t>
+        <w:t>B.8 — Vérifier</w:t>
+      </w:r>
+    </w:p>
+    <w:p>
+      <w:r>
+        <w:rPr>
+          <w:b/>
+        </w:rPr>
+        <w:t>serveur</w:t>
       </w:r>
     </w:p>
     <w:p>
@@ -1502,7 +2882,84 @@
         <w:pStyle w:val="CodeBlock"/>
       </w:pPr>
       <w:r>
-        <w:t>cd ~/infra-deploie</w:t>
+        <w:t>make verify ENV=dev VAULT_ARGS='--vault-password-file ../.vault-pass'</w:t>
+      </w:r>
+    </w:p>
+    <w:p>
+      <w:r>
+        <w:t xml:space="preserve">Attendu : </w:t>
+      </w:r>
+      <w:r>
+        <w:rPr>
+          <w:b/>
+        </w:rPr>
+        <w:t>« Le déploiement est sain, tous les contrôles sont passés. »</w:t>
+      </w:r>
+    </w:p>
+    <w:p>
+      <w:r>
+        <w:t>(</w:t>
+      </w:r>
+      <w:r>
+        <w:rPr>
+          <w:rFonts w:ascii="Consolas" w:hAnsi="Consolas"/>
+          <w:sz w:val="19"/>
+        </w:rPr>
+        <w:t>ok=21 failed=0</w:t>
+      </w:r>
+      <w:r>
+        <w:t>).</w:t>
+      </w:r>
+    </w:p>
+    <w:p>
+      <w:pPr>
+        <w:pStyle w:val="Heading2"/>
+      </w:pPr>
+      <w:r>
+        <w:t>B.9 — Accès navigateur depuis un poste</w:t>
+      </w:r>
+    </w:p>
+    <w:p>
+      <w:r>
+        <w:t xml:space="preserve">DuckDNS pointe le domaine vers l'IP </w:t>
+      </w:r>
+      <w:r>
+        <w:rPr>
+          <w:b/>
+        </w:rPr>
+        <w:t>publique</w:t>
+      </w:r>
+      <w:r>
+        <w:t>. Depuis le LAN, le fichier</w:t>
+      </w:r>
+    </w:p>
+    <w:p>
+      <w:r>
+        <w:rPr>
+          <w:rFonts w:ascii="Consolas" w:hAnsi="Consolas"/>
+          <w:sz w:val="19"/>
+        </w:rPr>
+        <w:t>hosts</w:t>
+      </w:r>
+      <w:r>
+        <w:t xml:space="preserve"> du poste pointe les hostnames vers l'IP </w:t>
+      </w:r>
+      <w:r>
+        <w:rPr>
+          <w:b/>
+        </w:rPr>
+        <w:t>LAN</w:t>
+      </w:r>
+      <w:r>
+        <w:t xml:space="preserve"> du serveur.</w:t>
+      </w:r>
+    </w:p>
+    <w:p>
+      <w:r>
+        <w:rPr>
+          <w:b/>
+        </w:rPr>
+        <w:t>serveur</w:t>
       </w:r>
     </w:p>
     <w:p>
@@ -1510,49 +2967,63 @@
         <w:pStyle w:val="CodeBlock"/>
       </w:pPr>
       <w:r>
-        <w:t>make configure ENV=dev VAULT_ARGS='--vault-password-file ../.vault-pass'</w:t>
+        <w:t>make urls ENV=dev</w:t>
       </w:r>
     </w:p>
     <w:p>
-      <w:r>
-        <w:t xml:space="preserve">En cas d'échec, relancer la même commande : le playbook est </w:t>
-      </w:r>
-      <w:r>
-        <w:rPr>
-          <w:b/>
-        </w:rPr>
-        <w:t>idempotent</w:t>
-      </w:r>
-      <w:r>
-        <w:t>.</w:t>
-      </w:r>
-    </w:p>
-    <w:p>
-      <w:r>
-        <w:t xml:space="preserve">Les certificats Let's Encrypt (wildcard </w:t>
+      <w:pPr>
+        <w:ind w:left="360" w:right="144"/>
+      </w:pPr>
+      <w:r>
+        <w:t xml:space="preserve">Ce bloc s'appuie sur </w:t>
       </w:r>
       <w:r>
         <w:rPr>
           <w:rFonts w:ascii="Consolas" w:hAnsi="Consolas"/>
           <w:sz w:val="19"/>
         </w:rPr>
-        <w:t>*.moninfra.duckdns.org</w:t>
-      </w:r>
-      <w:r>
-        <w:t>) sont émis</w:t>
+        <w:t>public_ip</w:t>
+      </w:r>
+      <w:r>
+        <w:t xml:space="preserve"> de l'inventaire et </w:t>
+      </w:r>
+      <w:r>
+        <w:rPr>
+          <w:rFonts w:ascii="Consolas" w:hAnsi="Consolas"/>
+          <w:sz w:val="19"/>
+        </w:rPr>
+        <w:t>infra_domain</w:t>
+      </w:r>
+      <w:r>
+        <w:t xml:space="preserve"> de </w:t>
+      </w:r>
+      <w:r>
+        <w:rPr>
+          <w:rFonts w:ascii="Consolas" w:hAnsi="Consolas"/>
+          <w:sz w:val="19"/>
+        </w:rPr>
+        <w:t>server_vars.yml</w:t>
+      </w:r>
+      <w:r>
+        <w:t xml:space="preserve"> (plus de </w:t>
+      </w:r>
+      <w:r>
+        <w:rPr>
+          <w:rFonts w:ascii="Consolas" w:hAnsi="Consolas"/>
+          <w:sz w:val="19"/>
+        </w:rPr>
+        <w:t>127.0.0.1</w:t>
+      </w:r>
+      <w:r>
+        <w:t xml:space="preserve"> ni de domaine par défaut erroné).</w:t>
       </w:r>
     </w:p>
     <w:p>
       <w:r>
-        <w:t>automatiquement au premier déploiement (DNS-01 DuckDNS).</w:t>
-      </w:r>
-    </w:p>
-    <w:p>
-      <w:pPr>
-        <w:pStyle w:val="Heading2"/>
-      </w:pPr>
-      <w:r>
-        <w:t>8. Vérifier</w:t>
+        <w:rPr>
+          <w:b/>
+        </w:rPr>
+        <w:t>Windows (admin)</w:t>
       </w:r>
     </w:p>
     <w:p>
@@ -1560,80 +3031,12 @@
         <w:pStyle w:val="CodeBlock"/>
       </w:pPr>
       <w:r>
-        <w:t>make verify ENV=dev VAULT_ARGS='--vault-password-file ../.vault-pass'</w:t>
+        <w:t>notepad C:\Windows\System32\drivers\etc\hosts</w:t>
       </w:r>
     </w:p>
     <w:p>
       <w:r>
-        <w:t>Tous les contrôles doivent passer (« Le déploiement est sain ») :</w:t>
-      </w:r>
-    </w:p>
-    <w:p>
-      <w:r>
-        <w:t>conteneurs actifs, ports limités à 80/443, authentifications HTTP,</w:t>
-      </w:r>
-    </w:p>
-    <w:p>
-      <w:r>
-        <w:t>ingestion Loki, scanner Trivy.</w:t>
-      </w:r>
-    </w:p>
-    <w:p>
-      <w:pPr>
-        <w:pStyle w:val="Heading2"/>
-      </w:pPr>
-      <w:r>
-        <w:t>9. Accès depuis un poste (browser)</w:t>
-      </w:r>
-    </w:p>
-    <w:p>
-      <w:r>
-        <w:t xml:space="preserve">DuckDNS pointe le domaine vers l'IP </w:t>
-      </w:r>
-      <w:r>
-        <w:rPr>
-          <w:b/>
-        </w:rPr>
-        <w:t>publique</w:t>
-      </w:r>
-      <w:r>
-        <w:t>. Depuis le LAN, ajouter</w:t>
-      </w:r>
-    </w:p>
-    <w:p>
-      <w:r>
-        <w:t xml:space="preserve">dans le fichier </w:t>
-      </w:r>
-      <w:r>
-        <w:rPr>
-          <w:rFonts w:ascii="Consolas" w:hAnsi="Consolas"/>
-          <w:sz w:val="19"/>
-        </w:rPr>
-        <w:t>hosts</w:t>
-      </w:r>
-      <w:r>
-        <w:t xml:space="preserve"> du poste (</w:t>
-      </w:r>
-      <w:r>
-        <w:rPr>
-          <w:rFonts w:ascii="Consolas" w:hAnsi="Consolas"/>
-          <w:sz w:val="19"/>
-        </w:rPr>
-        <w:t>notepad C:\Windows\System32\drivers\etc\hosts</w:t>
-      </w:r>
-    </w:p>
-    <w:p>
-      <w:r>
-        <w:t xml:space="preserve">en admin sous Windows) l'IP </w:t>
-      </w:r>
-      <w:r>
-        <w:rPr>
-          <w:b/>
-        </w:rPr>
-        <w:t>LAN</w:t>
-      </w:r>
-      <w:r>
-        <w:t xml:space="preserve"> de la VM (mode Bridged) :</w:t>
+        <w:t>Ajouter (IP LAN réelle + hostnames finaux) :</w:t>
       </w:r>
     </w:p>
     <w:p>
@@ -1641,7 +3044,7 @@
         <w:pStyle w:val="CodeBlock"/>
       </w:pPr>
       <w:r>
-        <w:t>&lt;ip-LAN-du-serveur&gt;  grafana.moninfra.duckdns.org</w:t>
+        <w:t>&lt;IP-LAN&gt;  grafana.&lt;sous-domaine&gt;.duckdns.org</w:t>
       </w:r>
     </w:p>
     <w:p>
@@ -1649,7 +3052,7 @@
         <w:pStyle w:val="CodeBlock"/>
       </w:pPr>
       <w:r>
-        <w:t>&lt;ip-LAN-du-serveur&gt;  prometheus.moninfra.duckdns.org</w:t>
+        <w:t>&lt;IP-LAN&gt;  prometheus.&lt;sous-domaine&gt;.duckdns.org</w:t>
       </w:r>
     </w:p>
     <w:p>
@@ -1657,7 +3060,7 @@
         <w:pStyle w:val="CodeBlock"/>
       </w:pPr>
       <w:r>
-        <w:t>&lt;ip-LAN-du-serveur&gt;  traefik.moninfra.duckdns.org</w:t>
+        <w:t>&lt;IP-LAN&gt;  traefik.&lt;sous-domaine&gt;.duckdns.org</w:t>
       </w:r>
     </w:p>
     <w:p>
@@ -1665,7 +3068,7 @@
         <w:pStyle w:val="CodeBlock"/>
       </w:pPr>
       <w:r>
-        <w:t>&lt;ip-LAN-du-serveur&gt;  whoami.moninfra.duckdns.org</w:t>
+        <w:t>&lt;IP-LAN&gt;  whoami.&lt;sous-domaine&gt;.duckdns.org</w:t>
       </w:r>
     </w:p>
     <w:p>
@@ -1673,7 +3076,7 @@
         <w:pStyle w:val="CodeBlock"/>
       </w:pPr>
       <w:r>
-        <w:t>&lt;ip-LAN-du-serveur&gt;  sonar.moninfra.duckdns.org</w:t>
+        <w:t>&lt;IP-LAN&gt;  sonar.&lt;sous-domaine&gt;.duckdns.org</w:t>
       </w:r>
     </w:p>
     <w:p>
@@ -1776,7 +3179,7 @@
                 <w:rFonts w:ascii="Consolas" w:hAnsi="Consolas"/>
                 <w:sz w:val="19"/>
               </w:rPr>
-              <w:t>https://grafana.moninfra.duckdns.org</w:t>
+              <w:t>https://grafana.&lt;sous-domaine&gt;.duckdns.org</w:t>
             </w:r>
           </w:p>
         </w:tc>
@@ -1802,7 +3205,7 @@
                 <w:rFonts w:ascii="Consolas" w:hAnsi="Consolas"/>
                 <w:sz w:val="19"/>
               </w:rPr>
-              <w:t>https://prometheus.moninfra.duckdns.org</w:t>
+              <w:t>https://prometheus.&lt;sous-domaine&gt;.duckdns.org</w:t>
             </w:r>
           </w:p>
         </w:tc>
@@ -1828,7 +3231,7 @@
                 <w:rFonts w:ascii="Consolas" w:hAnsi="Consolas"/>
                 <w:sz w:val="19"/>
               </w:rPr>
-              <w:t>https://traefik.moninfra.duckdns.org</w:t>
+              <w:t>https://traefik.&lt;sous-domaine&gt;.duckdns.org</w:t>
             </w:r>
           </w:p>
         </w:tc>
@@ -1854,7 +3257,7 @@
                 <w:rFonts w:ascii="Consolas" w:hAnsi="Consolas"/>
                 <w:sz w:val="19"/>
               </w:rPr>
-              <w:t>https://whoami.moninfra.duckdns.org</w:t>
+              <w:t>https://whoami.&lt;sous-domaine&gt;.duckdns.org</w:t>
             </w:r>
           </w:p>
         </w:tc>
@@ -1880,10 +3283,10 @@
                 <w:rFonts w:ascii="Consolas" w:hAnsi="Consolas"/>
                 <w:sz w:val="19"/>
               </w:rPr>
-              <w:t>https://sonar.moninfra.duckdns.org</w:t>
+              <w:t>https://sonar.&lt;sous-domaine&gt;.duckdns.org</w:t>
             </w:r>
             <w:r>
-              <w:t xml:space="preserve"> (si activé)</w:t>
+              <w:t xml:space="preserve"> (prod uniquement)</w:t>
             </w:r>
           </w:p>
         </w:tc>
@@ -1896,25 +3299,15 @@
     </w:p>
     <w:p>
       <w:r>
-        <w:t xml:space="preserve">Pour rappel des URL : </w:t>
-      </w:r>
-      <w:r>
-        <w:rPr>
-          <w:rFonts w:ascii="Consolas" w:hAnsi="Consolas"/>
-          <w:sz w:val="19"/>
-        </w:rPr>
-        <w:t>make urls ENV=dev</w:t>
-      </w:r>
-      <w:r>
-        <w:t>.</w:t>
+        <w:br w:type="page"/>
       </w:r>
     </w:p>
     <w:p>
       <w:pPr>
-        <w:pStyle w:val="Heading2"/>
+        <w:pStyle w:val="Heading1"/>
       </w:pPr>
       <w:r>
-        <w:t>10. Dépannage rapide</w:t>
+        <w:t>PARTIE C — Retour d'expérience (problèmes rencontrés)</w:t>
       </w:r>
     </w:p>
     <w:tbl>
@@ -1925,13 +3318,14 @@
         <w:tblLook w:firstColumn="1" w:firstRow="1" w:lastColumn="0" w:lastRow="0" w:noHBand="0" w:noVBand="1" w:val="04A0"/>
       </w:tblPr>
       <w:tblGrid>
-        <w:gridCol w:w="4320"/>
-        <w:gridCol w:w="4320"/>
+        <w:gridCol w:w="2880"/>
+        <w:gridCol w:w="2880"/>
+        <w:gridCol w:w="2880"/>
       </w:tblGrid>
       <w:tr>
         <w:tc>
           <w:tcPr>
-            <w:tcW w:type="dxa" w:w="4320"/>
+            <w:tcW w:type="dxa" w:w="2880"/>
           </w:tcPr>
           <w:p>
             <w:r>
@@ -1944,14 +3338,27 @@
         </w:tc>
         <w:tc>
           <w:tcPr>
-            <w:tcW w:type="dxa" w:w="4320"/>
+            <w:tcW w:type="dxa" w:w="2880"/>
           </w:tcPr>
           <w:p>
             <w:r>
               <w:rPr>
                 <w:b/>
               </w:rPr>
-              <w:t>Remède</w:t>
+              <w:t>Cause</w:t>
+            </w:r>
+          </w:p>
+        </w:tc>
+        <w:tc>
+          <w:tcPr>
+            <w:tcW w:type="dxa" w:w="2880"/>
+          </w:tcPr>
+          <w:p>
+            <w:r>
+              <w:rPr>
+                <w:b/>
+              </w:rPr>
+              <w:t>Correctif</w:t>
             </w:r>
           </w:p>
         </w:tc>
@@ -1959,7 +3366,7 @@
       <w:tr>
         <w:tc>
           <w:tcPr>
-            <w:tcW w:type="dxa" w:w="4320"/>
+            <w:tcW w:type="dxa" w:w="2880"/>
           </w:tcPr>
           <w:p>
             <w:r>
@@ -1969,7 +3376,17 @@
         </w:tc>
         <w:tc>
           <w:tcPr>
-            <w:tcW w:type="dxa" w:w="4320"/>
+            <w:tcW w:type="dxa" w:w="2880"/>
+          </w:tcPr>
+          <w:p>
+            <w:r>
+              <w:t>---</w:t>
+            </w:r>
+          </w:p>
+        </w:tc>
+        <w:tc>
+          <w:tcPr>
+            <w:tcW w:type="dxa" w:w="2880"/>
           </w:tcPr>
           <w:p>
             <w:r>
@@ -1981,36 +3398,7 @@
       <w:tr>
         <w:tc>
           <w:tcPr>
-            <w:tcW w:type="dxa" w:w="4320"/>
-          </w:tcPr>
-          <w:p>
-            <w:r>
-              <w:t>Playbook bloque sur le vault</w:t>
-            </w:r>
-          </w:p>
-        </w:tc>
-        <w:tc>
-          <w:tcPr>
-            <w:tcW w:type="dxa" w:w="4320"/>
-          </w:tcPr>
-          <w:p>
-            <w:r>
-              <w:t xml:space="preserve">Utiliser </w:t>
-            </w:r>
-            <w:r>
-              <w:rPr>
-                <w:rFonts w:ascii="Consolas" w:hAnsi="Consolas"/>
-                <w:sz w:val="19"/>
-              </w:rPr>
-              <w:t>VAULT_ARGS='--vault-password-file ../.vault-pass'</w:t>
-            </w:r>
-          </w:p>
-        </w:tc>
-      </w:tr>
-      <w:tr>
-        <w:tc>
-          <w:tcPr>
-            <w:tcW w:type="dxa" w:w="4320"/>
+            <w:tcW w:type="dxa" w:w="2880"/>
           </w:tcPr>
           <w:p>
             <w:r>
@@ -2018,37 +3406,41 @@
                 <w:rFonts w:ascii="Consolas" w:hAnsi="Consolas"/>
                 <w:sz w:val="19"/>
               </w:rPr>
-              <w:t>Certificat</w:t>
-            </w:r>
-            <w:r>
-              <w:t xml:space="preserve"> invalide</w:t>
+              <w:t>scripts/standalone-prep.sh: Permission denied</w:t>
             </w:r>
           </w:p>
         </w:tc>
         <w:tc>
           <w:tcPr>
-            <w:tcW w:type="dxa" w:w="4320"/>
+            <w:tcW w:type="dxa" w:w="2880"/>
           </w:tcPr>
           <w:p>
             <w:r>
-              <w:t xml:space="preserve">Vérifier </w:t>
+              <w:t>droit d'exécution absent sur les fichiers clonés</w:t>
+            </w:r>
+          </w:p>
+        </w:tc>
+        <w:tc>
+          <w:tcPr>
+            <w:tcW w:type="dxa" w:w="2880"/>
+          </w:tcPr>
+          <w:p>
+            <w:r>
+              <w:rPr>
+                <w:rFonts w:ascii="Consolas" w:hAnsi="Consolas"/>
+                <w:sz w:val="19"/>
+              </w:rPr>
+              <w:t>bash scripts/standalone-prep.sh dev</w:t>
+            </w:r>
+            <w:r>
+              <w:t xml:space="preserve"> (et non </w:t>
             </w:r>
             <w:r>
               <w:rPr>
                 <w:rFonts w:ascii="Consolas" w:hAnsi="Consolas"/>
                 <w:sz w:val="19"/>
               </w:rPr>
-              <w:t>duckdns_token</w:t>
-            </w:r>
-            <w:r>
-              <w:t xml:space="preserve"> + propagation DNS (</w:t>
-            </w:r>
-            <w:r>
-              <w:rPr>
-                <w:rFonts w:ascii="Consolas" w:hAnsi="Consolas"/>
-                <w:sz w:val="19"/>
-              </w:rPr>
-              <w:t>dig TXT _acme-challenge.moninfra.duckdns.org</w:t>
+              <w:t>./…</w:t>
             </w:r>
             <w:r>
               <w:t>)</w:t>
@@ -2059,31 +3451,55 @@
       <w:tr>
         <w:tc>
           <w:tcPr>
-            <w:tcW w:type="dxa" w:w="4320"/>
+            <w:tcW w:type="dxa" w:w="2880"/>
           </w:tcPr>
           <w:p>
             <w:r>
-              <w:t>Timeout HTTP</w:t>
+              <w:rPr>
+                <w:rFonts w:ascii="Consolas" w:hAnsi="Consolas"/>
+                <w:sz w:val="19"/>
+              </w:rPr>
+              <w:t>error: externally-managed-environment</w:t>
+            </w:r>
+            <w:r>
+              <w:t xml:space="preserve"> (Ubuntu 24.04)</w:t>
             </w:r>
           </w:p>
         </w:tc>
         <w:tc>
           <w:tcPr>
-            <w:tcW w:type="dxa" w:w="4320"/>
+            <w:tcW w:type="dxa" w:w="2880"/>
           </w:tcPr>
           <w:p>
             <w:r>
-              <w:t xml:space="preserve">Vérifier </w:t>
+              <w:t xml:space="preserve">PEP 668 bloque </w:t>
             </w:r>
             <w:r>
               <w:rPr>
                 <w:rFonts w:ascii="Consolas" w:hAnsi="Consolas"/>
                 <w:sz w:val="19"/>
               </w:rPr>
-              <w:t>hosts</w:t>
+              <w:t>pip --user</w:t>
+            </w:r>
+          </w:p>
+        </w:tc>
+        <w:tc>
+          <w:tcPr>
+            <w:tcW w:type="dxa" w:w="2880"/>
+          </w:tcPr>
+          <w:p>
+            <w:r>
+              <w:t xml:space="preserve">le script relance avec </w:t>
             </w:r>
             <w:r>
-              <w:t xml:space="preserve"> du poste + IP LAN correcte</w:t>
+              <w:rPr>
+                <w:rFonts w:ascii="Consolas" w:hAnsi="Consolas"/>
+                <w:sz w:val="19"/>
+              </w:rPr>
+              <w:t>--break-system-packages</w:t>
+            </w:r>
+            <w:r>
+              <w:t xml:space="preserve"> ; sinon à la main</w:t>
             </w:r>
           </w:p>
         </w:tc>
@@ -2091,17 +3507,7 @@
       <w:tr>
         <w:tc>
           <w:tcPr>
-            <w:tcW w:type="dxa" w:w="4320"/>
-          </w:tcPr>
-          <w:p>
-            <w:r>
-              <w:t>SonarQube absent malgré utilisation</w:t>
-            </w:r>
-          </w:p>
-        </w:tc>
-        <w:tc>
-          <w:tcPr>
-            <w:tcW w:type="dxa" w:w="4320"/>
+            <w:tcW w:type="dxa" w:w="2880"/>
           </w:tcPr>
           <w:p>
             <w:r>
@@ -2109,10 +3515,47 @@
                 <w:rFonts w:ascii="Consolas" w:hAnsi="Consolas"/>
                 <w:sz w:val="19"/>
               </w:rPr>
-              <w:t>enable_sonarqube: true</w:t>
+              <w:t>community.docker</w:t>
             </w:r>
             <w:r>
-              <w:t xml:space="preserve"> (prod) ou RAM ≥ 8 Go</w:t>
+              <w:t xml:space="preserve"> non trouvé après le script</w:t>
+            </w:r>
+          </w:p>
+        </w:tc>
+        <w:tc>
+          <w:tcPr>
+            <w:tcW w:type="dxa" w:w="2880"/>
+          </w:tcPr>
+          <w:p>
+            <w:r>
+              <w:t xml:space="preserve">l'ancien test </w:t>
+            </w:r>
+            <w:r>
+              <w:rPr>
+                <w:rFonts w:ascii="Consolas" w:hAnsi="Consolas"/>
+                <w:sz w:val="19"/>
+              </w:rPr>
+              <w:t>collection list</w:t>
+            </w:r>
+            <w:r>
+              <w:t xml:space="preserve"> retournait 0 même vide</w:t>
+            </w:r>
+          </w:p>
+        </w:tc>
+        <w:tc>
+          <w:tcPr>
+            <w:tcW w:type="dxa" w:w="2880"/>
+          </w:tcPr>
+          <w:p>
+            <w:r>
+              <w:t xml:space="preserve">le script vérifie désormais la présence des dossiers ; sinon </w:t>
+            </w:r>
+            <w:r>
+              <w:rPr>
+                <w:rFonts w:ascii="Consolas" w:hAnsi="Consolas"/>
+                <w:sz w:val="19"/>
+              </w:rPr>
+              <w:t>ansible-galaxy collection install -r ansible/requirements.yml</w:t>
             </w:r>
           </w:p>
         </w:tc>
@@ -2120,19 +3563,474 @@
       <w:tr>
         <w:tc>
           <w:tcPr>
-            <w:tcW w:type="dxa" w:w="4320"/>
+            <w:tcW w:type="dxa" w:w="2880"/>
           </w:tcPr>
           <w:p>
             <w:r>
-              <w:t>Mauvais domaine</w:t>
+              <w:rPr>
+                <w:rFonts w:ascii="Consolas" w:hAnsi="Consolas"/>
+                <w:sz w:val="19"/>
+              </w:rPr>
+              <w:t>make</w:t>
+            </w:r>
+            <w:r>
+              <w:t xml:space="preserve"> ne trouve pas </w:t>
+            </w:r>
+            <w:r>
+              <w:rPr>
+                <w:rFonts w:ascii="Consolas" w:hAnsi="Consolas"/>
+                <w:sz w:val="19"/>
+              </w:rPr>
+              <w:t>ansible-playbook</w:t>
             </w:r>
           </w:p>
         </w:tc>
         <w:tc>
           <w:tcPr>
-            <w:tcW w:type="dxa" w:w="4320"/>
+            <w:tcW w:type="dxa" w:w="2880"/>
           </w:tcPr>
           <w:p>
+            <w:r>
+              <w:rPr>
+                <w:rFonts w:ascii="Consolas" w:hAnsi="Consolas"/>
+                <w:sz w:val="19"/>
+              </w:rPr>
+              <w:t>~/.local/bin</w:t>
+            </w:r>
+            <w:r>
+              <w:t xml:space="preserve"> absent du PATH (nouvelle session)</w:t>
+            </w:r>
+          </w:p>
+        </w:tc>
+        <w:tc>
+          <w:tcPr>
+            <w:tcW w:type="dxa" w:w="2880"/>
+          </w:tcPr>
+          <w:p>
+            <w:r>
+              <w:rPr>
+                <w:rFonts w:ascii="Consolas" w:hAnsi="Consolas"/>
+                <w:sz w:val="19"/>
+              </w:rPr>
+              <w:t>export PATH="$HOME/.local/bin:$PATH"</w:t>
+            </w:r>
+            <w:r>
+              <w:t xml:space="preserve"> / ajout auto dans </w:t>
+            </w:r>
+            <w:r>
+              <w:rPr>
+                <w:rFonts w:ascii="Consolas" w:hAnsi="Consolas"/>
+                <w:sz w:val="19"/>
+              </w:rPr>
+              <w:t>~/.bashrc</w:t>
+            </w:r>
+          </w:p>
+        </w:tc>
+      </w:tr>
+      <w:tr>
+        <w:tc>
+          <w:tcPr>
+            <w:tcW w:type="dxa" w:w="2880"/>
+          </w:tcPr>
+          <w:p>
+            <w:r>
+              <w:t xml:space="preserve">vault qui s'affiche « illisible » au </w:t>
+            </w:r>
+            <w:r>
+              <w:rPr>
+                <w:rFonts w:ascii="Consolas" w:hAnsi="Consolas"/>
+                <w:sz w:val="19"/>
+              </w:rPr>
+              <w:t>nano</w:t>
+            </w:r>
+          </w:p>
+        </w:tc>
+        <w:tc>
+          <w:tcPr>
+            <w:tcW w:type="dxa" w:w="2880"/>
+          </w:tcPr>
+          <w:p>
+            <w:r>
+              <w:t xml:space="preserve">fichier </w:t>
+            </w:r>
+            <w:r>
+              <w:rPr>
+                <w:b/>
+              </w:rPr>
+              <w:t>chiffré</w:t>
+            </w:r>
+            <w:r>
+              <w:t xml:space="preserve"> ouvert directement</w:t>
+            </w:r>
+          </w:p>
+        </w:tc>
+        <w:tc>
+          <w:tcPr>
+            <w:tcW w:type="dxa" w:w="2880"/>
+          </w:tcPr>
+          <w:p>
+            <w:r>
+              <w:rPr>
+                <w:rFonts w:ascii="Consolas" w:hAnsi="Consolas"/>
+                <w:sz w:val="19"/>
+              </w:rPr>
+              <w:t>EDITOR=nano ansible-vault edit -…</w:t>
+            </w:r>
+          </w:p>
+        </w:tc>
+      </w:tr>
+      <w:tr>
+        <w:tc>
+          <w:tcPr>
+            <w:tcW w:type="dxa" w:w="2880"/>
+          </w:tcPr>
+          <w:p>
+            <w:r>
+              <w:t>« je ne peux pas taper » dans le vault</w:t>
+            </w:r>
+          </w:p>
+        </w:tc>
+        <w:tc>
+          <w:tcPr>
+            <w:tcW w:type="dxa" w:w="2880"/>
+          </w:tcPr>
+          <w:p>
+            <w:r>
+              <w:t xml:space="preserve">Ansible ouvre </w:t>
+            </w:r>
+            <w:r>
+              <w:rPr>
+                <w:rFonts w:ascii="Consolas" w:hAnsi="Consolas"/>
+                <w:sz w:val="19"/>
+              </w:rPr>
+              <w:t>vi</w:t>
+            </w:r>
+            <w:r>
+              <w:t xml:space="preserve"> (pas nano)</w:t>
+            </w:r>
+          </w:p>
+        </w:tc>
+        <w:tc>
+          <w:tcPr>
+            <w:tcW w:type="dxa" w:w="2880"/>
+          </w:tcPr>
+          <w:p>
+            <w:r>
+              <w:rPr>
+                <w:rFonts w:ascii="Consolas" w:hAnsi="Consolas"/>
+                <w:sz w:val="19"/>
+              </w:rPr>
+              <w:t>EDITOR=nano</w:t>
+            </w:r>
+            <w:r>
+              <w:t xml:space="preserve"> devant la commande</w:t>
+            </w:r>
+          </w:p>
+        </w:tc>
+      </w:tr>
+      <w:tr>
+        <w:tc>
+          <w:tcPr>
+            <w:tcW w:type="dxa" w:w="2880"/>
+          </w:tcPr>
+          <w:p>
+            <w:r>
+              <w:rPr>
+                <w:rFonts w:ascii="Consolas" w:hAnsi="Consolas"/>
+                <w:sz w:val="19"/>
+              </w:rPr>
+              <w:t>duckdns_token</w:t>
+            </w:r>
+            <w:r>
+              <w:t xml:space="preserve"> refusé à la lecture du vault</w:t>
+            </w:r>
+          </w:p>
+        </w:tc>
+        <w:tc>
+          <w:tcPr>
+            <w:tcW w:type="dxa" w:w="2880"/>
+          </w:tcPr>
+          <w:p>
+            <w:r>
+              <w:t>espaces en début de ligne (YAML)</w:t>
+            </w:r>
+          </w:p>
+        </w:tc>
+        <w:tc>
+          <w:tcPr>
+            <w:tcW w:type="dxa" w:w="2880"/>
+          </w:tcPr>
+          <w:p>
+            <w:r>
+              <w:t xml:space="preserve">replacer </w:t>
+            </w:r>
+            <w:r>
+              <w:rPr>
+                <w:rFonts w:ascii="Consolas" w:hAnsi="Consolas"/>
+                <w:sz w:val="19"/>
+              </w:rPr>
+              <w:t>duckdns_token:</w:t>
+            </w:r>
+            <w:r>
+              <w:t xml:space="preserve"> / </w:t>
+            </w:r>
+            <w:r>
+              <w:rPr>
+                <w:rFonts w:ascii="Consolas" w:hAnsi="Consolas"/>
+                <w:sz w:val="19"/>
+              </w:rPr>
+              <w:t>duckdns_domains:</w:t>
+            </w:r>
+            <w:r>
+              <w:t xml:space="preserve"> à la colonne 0</w:t>
+            </w:r>
+          </w:p>
+        </w:tc>
+      </w:tr>
+      <w:tr>
+        <w:tc>
+          <w:tcPr>
+            <w:tcW w:type="dxa" w:w="2880"/>
+          </w:tcPr>
+          <w:p>
+            <w:r>
+              <w:rPr>
+                <w:rFonts w:ascii="Consolas" w:hAnsi="Consolas"/>
+                <w:sz w:val="19"/>
+              </w:rPr>
+              <w:t>ansible-vault encrypt</w:t>
+            </w:r>
+            <w:r>
+              <w:t xml:space="preserve"> re-lancé → problème</w:t>
+            </w:r>
+          </w:p>
+        </w:tc>
+        <w:tc>
+          <w:tcPr>
+            <w:tcW w:type="dxa" w:w="2880"/>
+          </w:tcPr>
+          <w:p>
+            <w:r>
+              <w:t>le fichier est déjà chiffré par le script</w:t>
+            </w:r>
+          </w:p>
+        </w:tc>
+        <w:tc>
+          <w:tcPr>
+            <w:tcW w:type="dxa" w:w="2880"/>
+          </w:tcPr>
+          <w:p>
+            <w:r>
+              <w:t xml:space="preserve">ne pas relancer ; éditer via </w:t>
+            </w:r>
+            <w:r>
+              <w:rPr>
+                <w:rFonts w:ascii="Consolas" w:hAnsi="Consolas"/>
+                <w:sz w:val="19"/>
+              </w:rPr>
+              <w:t>ansible-vault edit</w:t>
+            </w:r>
+          </w:p>
+        </w:tc>
+      </w:tr>
+      <w:tr>
+        <w:tc>
+          <w:tcPr>
+            <w:tcW w:type="dxa" w:w="2880"/>
+          </w:tcPr>
+          <w:p>
+            <w:r>
+              <w:rPr>
+                <w:rFonts w:ascii="Consolas" w:hAnsi="Consolas"/>
+                <w:sz w:val="19"/>
+              </w:rPr>
+              <w:t>Missing sudo password</w:t>
+            </w:r>
+            <w:r>
+              <w:t xml:space="preserve"> (double </w:t>
+            </w:r>
+            <w:r>
+              <w:rPr>
+                <w:rFonts w:ascii="Consolas" w:hAnsi="Consolas"/>
+                <w:sz w:val="19"/>
+              </w:rPr>
+              <w:t>sudo</w:t>
+            </w:r>
+            <w:r>
+              <w:t>)</w:t>
+            </w:r>
+          </w:p>
+        </w:tc>
+        <w:tc>
+          <w:tcPr>
+            <w:tcW w:type="dxa" w:w="2880"/>
+          </w:tcPr>
+          <w:p>
+            <w:r>
+              <w:rPr>
+                <w:rFonts w:ascii="Consolas" w:hAnsi="Consolas"/>
+                <w:sz w:val="19"/>
+              </w:rPr>
+              <w:t>ansible_become_password</w:t>
+            </w:r>
+            <w:r>
+              <w:t xml:space="preserve"> vide</w:t>
+            </w:r>
+          </w:p>
+        </w:tc>
+        <w:tc>
+          <w:tcPr>
+            <w:tcW w:type="dxa" w:w="2880"/>
+          </w:tcPr>
+          <w:p>
+            <w:r>
+              <w:t xml:space="preserve">remplir </w:t>
+            </w:r>
+            <w:r>
+              <w:rPr>
+                <w:rFonts w:ascii="Consolas" w:hAnsi="Consolas"/>
+                <w:sz w:val="19"/>
+              </w:rPr>
+              <w:t>hosts.ini</w:t>
+            </w:r>
+            <w:r>
+              <w:t xml:space="preserve"> ou </w:t>
+            </w:r>
+            <w:r>
+              <w:rPr>
+                <w:rFonts w:ascii="Consolas" w:hAnsi="Consolas"/>
+                <w:sz w:val="19"/>
+              </w:rPr>
+              <w:t>--ask-become-pass</w:t>
+            </w:r>
+          </w:p>
+        </w:tc>
+      </w:tr>
+      <w:tr>
+        <w:tc>
+          <w:tcPr>
+            <w:tcW w:type="dxa" w:w="2880"/>
+          </w:tcPr>
+          <w:p>
+            <w:r>
+              <w:rPr>
+                <w:rFonts w:ascii="Consolas" w:hAnsi="Consolas"/>
+                <w:sz w:val="19"/>
+              </w:rPr>
+              <w:t>PasswordAuthentication</w:t>
+            </w:r>
+            <w:r>
+              <w:t xml:space="preserve"> toujours accepté</w:t>
+            </w:r>
+          </w:p>
+        </w:tc>
+        <w:tc>
+          <w:tcPr>
+            <w:tcW w:type="dxa" w:w="2880"/>
+          </w:tcPr>
+          <w:p>
+            <w:r>
+              <w:rPr>
+                <w:rFonts w:ascii="Consolas" w:hAnsi="Consolas"/>
+                <w:sz w:val="19"/>
+              </w:rPr>
+              <w:t>50-cloud-init.conf</w:t>
+            </w:r>
+            <w:r>
+              <w:t xml:space="preserve"> lu avant le fichier de durcissement</w:t>
+            </w:r>
+          </w:p>
+        </w:tc>
+        <w:tc>
+          <w:tcPr>
+            <w:tcW w:type="dxa" w:w="2880"/>
+          </w:tcPr>
+          <w:p>
+            <w:r>
+              <w:t xml:space="preserve">nommer le fichier </w:t>
+            </w:r>
+            <w:r>
+              <w:rPr>
+                <w:b/>
+              </w:rPr>
+              <w:t>`00-hardening.conf`</w:t>
+            </w:r>
+          </w:p>
+        </w:tc>
+      </w:tr>
+      <w:tr>
+        <w:tc>
+          <w:tcPr>
+            <w:tcW w:type="dxa" w:w="2880"/>
+          </w:tcPr>
+          <w:p>
+            <w:r>
+              <w:rPr>
+                <w:rFonts w:ascii="Consolas" w:hAnsi="Consolas"/>
+                <w:sz w:val="19"/>
+              </w:rPr>
+              <w:t>make urls</w:t>
+            </w:r>
+            <w:r>
+              <w:t xml:space="preserve"> affiche </w:t>
+            </w:r>
+            <w:r>
+              <w:rPr>
+                <w:rFonts w:ascii="Consolas" w:hAnsi="Consolas"/>
+                <w:sz w:val="19"/>
+              </w:rPr>
+              <w:t>127.0.0.1</w:t>
+            </w:r>
+            <w:r>
+              <w:t xml:space="preserve"> ou le mauvais domaine</w:t>
+            </w:r>
+          </w:p>
+        </w:tc>
+        <w:tc>
+          <w:tcPr>
+            <w:tcW w:type="dxa" w:w="2880"/>
+          </w:tcPr>
+          <w:p>
+            <w:r>
+              <w:t xml:space="preserve">ancienne lecture </w:t>
+            </w:r>
+            <w:r>
+              <w:rPr>
+                <w:rFonts w:ascii="Consolas" w:hAnsi="Consolas"/>
+                <w:sz w:val="19"/>
+              </w:rPr>
+              <w:t>ansible_host</w:t>
+            </w:r>
+            <w:r>
+              <w:t xml:space="preserve"> + </w:t>
+            </w:r>
+            <w:r>
+              <w:rPr>
+                <w:rFonts w:ascii="Consolas" w:hAnsi="Consolas"/>
+                <w:sz w:val="19"/>
+              </w:rPr>
+              <w:t>group_vars/&lt;env&gt;.yml</w:t>
+            </w:r>
+          </w:p>
+        </w:tc>
+        <w:tc>
+          <w:tcPr>
+            <w:tcW w:type="dxa" w:w="2880"/>
+          </w:tcPr>
+          <w:p>
+            <w:r>
+              <w:t xml:space="preserve">corrigé : </w:t>
+            </w:r>
+            <w:r>
+              <w:rPr>
+                <w:rFonts w:ascii="Consolas" w:hAnsi="Consolas"/>
+                <w:sz w:val="19"/>
+              </w:rPr>
+              <w:t>public_ip</w:t>
+            </w:r>
+            <w:r>
+              <w:t xml:space="preserve"> + </w:t>
+            </w:r>
             <w:r>
               <w:rPr>
                 <w:rFonts w:ascii="Consolas" w:hAnsi="Consolas"/>
@@ -2141,7 +4039,7 @@
               <w:t>infra_domain</w:t>
             </w:r>
             <w:r>
-              <w:t xml:space="preserve"> dans </w:t>
+              <w:t xml:space="preserve"> depuis </w:t>
             </w:r>
             <w:r>
               <w:rPr>
@@ -2156,51 +4054,41 @@
       <w:tr>
         <w:tc>
           <w:tcPr>
-            <w:tcW w:type="dxa" w:w="4320"/>
+            <w:tcW w:type="dxa" w:w="2880"/>
           </w:tcPr>
           <w:p>
             <w:r>
-              <w:t xml:space="preserve">Rôle </w:t>
+              <w:t xml:space="preserve">Avertissements </w:t>
             </w:r>
             <w:r>
               <w:rPr>
                 <w:rFonts w:ascii="Consolas" w:hAnsi="Consolas"/>
                 <w:sz w:val="19"/>
               </w:rPr>
-              <w:t>common</w:t>
+              <w:t>DEPRECATION WARNING</w:t>
             </w:r>
             <w:r>
-              <w:t xml:space="preserve"> introuvable</w:t>
+              <w:t xml:space="preserve"> (apt_repository, facts)</w:t>
             </w:r>
           </w:p>
         </w:tc>
         <w:tc>
           <w:tcPr>
-            <w:tcW w:type="dxa" w:w="4320"/>
+            <w:tcW w:type="dxa" w:w="2880"/>
           </w:tcPr>
           <w:p>
             <w:r>
-              <w:t xml:space="preserve">Lancer depuis </w:t>
+              <w:t>obsolescences Ansible</w:t>
             </w:r>
+          </w:p>
+        </w:tc>
+        <w:tc>
+          <w:tcPr>
+            <w:tcW w:type="dxa" w:w="2880"/>
+          </w:tcPr>
+          <w:p>
             <w:r>
-              <w:rPr>
-                <w:rFonts w:ascii="Consolas" w:hAnsi="Consolas"/>
-                <w:sz w:val="19"/>
-              </w:rPr>
-              <w:t>ansible/</w:t>
-            </w:r>
-            <w:r>
-              <w:t xml:space="preserve"> ou via </w:t>
-            </w:r>
-            <w:r>
-              <w:rPr>
-                <w:rFonts w:ascii="Consolas" w:hAnsi="Consolas"/>
-                <w:sz w:val="19"/>
-              </w:rPr>
-              <w:t>make</w:t>
-            </w:r>
-            <w:r>
-              <w:t xml:space="preserve"> (et non la racine le playbook seul)</w:t>
+              <w:t>sans impact fonctionnel ; ignorables</w:t>
             </w:r>
           </w:p>
         </w:tc>
@@ -2216,7 +4104,7 @@
         <w:pStyle w:val="Heading2"/>
       </w:pPr>
       <w:r>
-        <w:t>11. Rappels de sécurité</w:t>
+        <w:t>Rappels de sécurité</w:t>
       </w:r>
     </w:p>
     <w:p>
@@ -2256,16 +4144,7 @@
         <w:pStyle w:val="ListBullet"/>
       </w:pPr>
       <w:r>
-        <w:t xml:space="preserve">Ne </w:t>
-      </w:r>
-      <w:r>
-        <w:rPr>
-          <w:b/>
-        </w:rPr>
-        <w:t>jamais</w:t>
-      </w:r>
-      <w:r>
-        <w:t xml:space="preserve"> commiter </w:t>
+        <w:t xml:space="preserve">Ne jamais commiter </w:t>
       </w:r>
       <w:r>
         <w:rPr>
@@ -2295,12 +4174,7 @@
         <w:t>.vault-pass</w:t>
       </w:r>
       <w:r>
-        <w:t>,</w:t>
-      </w:r>
-    </w:p>
-    <w:p>
-      <w:r>
-        <w:t xml:space="preserve">  </w:t>
+        <w:t xml:space="preserve">, </w:t>
       </w:r>
       <w:r>
         <w:rPr>
@@ -2309,8 +4183,10 @@
         </w:rPr>
         <w:t>server_vars.yml</w:t>
       </w:r>
-      <w:r>
-        <w:t xml:space="preserve"> (tous déjà dans </w:t>
+    </w:p>
+    <w:p>
+      <w:r>
+        <w:t xml:space="preserve">  (déjà dans </w:t>
       </w:r>
       <w:r>
         <w:rPr>
@@ -2328,7 +4204,7 @@
         <w:pStyle w:val="ListBullet"/>
       </w:pPr>
       <w:r>
-        <w:t xml:space="preserve">En production, restreindre </w:t>
+        <w:t xml:space="preserve">En production : restreindre </w:t>
       </w:r>
       <w:r>
         <w:rPr>
@@ -2338,22 +4214,7 @@
         <w:t>admin_cidr</w:t>
       </w:r>
       <w:r>
-        <w:t xml:space="preserve"> dans </w:t>
-      </w:r>
-      <w:r>
-        <w:rPr>
-          <w:rFonts w:ascii="Consolas" w:hAnsi="Consolas"/>
-          <w:sz w:val="19"/>
-        </w:rPr>
-        <w:t>server_vars.yml</w:t>
-      </w:r>
-      <w:r>
-        <w:t xml:space="preserve"> (jamais</w:t>
-      </w:r>
-    </w:p>
-    <w:p>
-      <w:r>
-        <w:t xml:space="preserve">  </w:t>
+        <w:t xml:space="preserve"> (jamais </w:t>
       </w:r>
       <w:r>
         <w:rPr>
@@ -2363,7 +4224,12 @@
         <w:t>0.0.0.0/0</w:t>
       </w:r>
       <w:r>
-        <w:t>) et activer SonarQube.</w:t>
+        <w:t>) et activer</w:t>
+      </w:r>
+    </w:p>
+    <w:p>
+      <w:r>
+        <w:t xml:space="preserve">  SonarQube.</w:t>
       </w:r>
     </w:p>
     <w:p>
@@ -2371,7 +4237,7 @@
         <w:pStyle w:val="Heading2"/>
       </w:pPr>
       <w:r>
-        <w:t>12. Références</w:t>
+        <w:t>Références</w:t>
       </w:r>
     </w:p>
     <w:p>
@@ -2386,10 +4252,10 @@
           <w:rFonts w:ascii="Consolas" w:hAnsi="Consolas"/>
           <w:sz w:val="19"/>
         </w:rPr>
-        <w:t>MANUEL.MD</w:t>
-      </w:r>
-      <w:r>
-        <w:t xml:space="preserve"> → export Word </w:t>
+        <w:t>MANUEL.md</w:t>
+      </w:r>
+      <w:r>
+        <w:t xml:space="preserve"> ⇄ </w:t>
       </w:r>
       <w:r>
         <w:rPr>
@@ -2404,7 +4270,47 @@
         <w:pStyle w:val="ListBullet"/>
       </w:pPr>
       <w:r>
-        <w:t xml:space="preserve">Réseau / DNS / TLS : </w:t>
+        <w:t xml:space="preserve">Le script de préparation : </w:t>
+      </w:r>
+      <w:r>
+        <w:rPr>
+          <w:rFonts w:ascii="Consolas" w:hAnsi="Consolas"/>
+          <w:sz w:val="19"/>
+        </w:rPr>
+        <w:t>scripts/standalone-prep.sh</w:t>
+      </w:r>
+    </w:p>
+    <w:p>
+      <w:pPr>
+        <w:pStyle w:val="ListBullet"/>
+      </w:pPr>
+      <w:r>
+        <w:t xml:space="preserve">Variables serveur : </w:t>
+      </w:r>
+      <w:r>
+        <w:rPr>
+          <w:rFonts w:ascii="Consolas" w:hAnsi="Consolas"/>
+          <w:sz w:val="19"/>
+        </w:rPr>
+        <w:t>ansible/group_vars/server_vars.yml.example</w:t>
+      </w:r>
+    </w:p>
+    <w:p>
+      <w:pPr>
+        <w:pStyle w:val="ListBullet"/>
+      </w:pPr>
+      <w:r>
+        <w:t xml:space="preserve">Things détaillées : </w:t>
+      </w:r>
+      <w:r>
+        <w:rPr>
+          <w:rFonts w:ascii="Consolas" w:hAnsi="Consolas"/>
+          <w:sz w:val="19"/>
+        </w:rPr>
+        <w:t>docs/08-deploiement.md</w:t>
+      </w:r>
+      <w:r>
+        <w:t xml:space="preserve"> (§8.1 bis), </w:t>
       </w:r>
       <w:r>
         <w:rPr>
@@ -2412,69 +4318,6 @@
           <w:sz w:val="19"/>
         </w:rPr>
         <w:t>docs/09-reseau-dns-tls.md</w:t>
-      </w:r>
-    </w:p>
-    <w:p>
-      <w:pPr>
-        <w:pStyle w:val="ListBullet"/>
-      </w:pPr>
-      <w:r>
-        <w:t xml:space="preserve">Déploiement (détail) : </w:t>
-      </w:r>
-      <w:r>
-        <w:rPr>
-          <w:rFonts w:ascii="Consolas" w:hAnsi="Consolas"/>
-          <w:sz w:val="19"/>
-        </w:rPr>
-        <w:t>docs/08-deploiement.md</w:t>
-      </w:r>
-      <w:r>
-        <w:t xml:space="preserve"> (§8.1 bis « mode standalone »)</w:t>
-      </w:r>
-    </w:p>
-    <w:p>
-      <w:pPr>
-        <w:pStyle w:val="ListBullet"/>
-      </w:pPr>
-      <w:r>
-        <w:t xml:space="preserve">Prérequis : </w:t>
-      </w:r>
-      <w:r>
-        <w:rPr>
-          <w:rFonts w:ascii="Consolas" w:hAnsi="Consolas"/>
-          <w:sz w:val="19"/>
-        </w:rPr>
-        <w:t>docs/03-prerequis.md</w:t>
-      </w:r>
-    </w:p>
-    <w:p>
-      <w:pPr>
-        <w:pStyle w:val="ListBullet"/>
-      </w:pPr>
-      <w:r>
-        <w:t xml:space="preserve">Le script : </w:t>
-      </w:r>
-      <w:r>
-        <w:rPr>
-          <w:rFonts w:ascii="Consolas" w:hAnsi="Consolas"/>
-          <w:sz w:val="19"/>
-        </w:rPr>
-        <w:t>scripts/standalone-prep.sh</w:t>
-      </w:r>
-    </w:p>
-    <w:p>
-      <w:pPr>
-        <w:pStyle w:val="ListBullet"/>
-      </w:pPr>
-      <w:r>
-        <w:t xml:space="preserve">Variables serveur : </w:t>
-      </w:r>
-      <w:r>
-        <w:rPr>
-          <w:rFonts w:ascii="Consolas" w:hAnsi="Consolas"/>
-          <w:sz w:val="19"/>
-        </w:rPr>
-        <w:t>ansible/group_vars/server_vars.yml.example</w:t>
       </w:r>
     </w:p>
     <w:sectPr>

</xml_diff>